<commit_message>
Ask: Claude Haiku 5.5 first through AI Gateway, Gemini as fallback
When ANTHROPIC_API_KEY is set, Ask calls claude-haiku-5-5 (Anthropic
Messages API via the same AI Gateway). Any error or unusable reply falls
back to the existing four-model Gemini chain. Without the key nothing
changes. finish() hides Claude/Anthropic like Gemini/Google.
ASK-048..051 added; 608 passed. ZP-DOC-06 updated.

Co-Authored-By: Claude Opus 5.5 (1M context) <noreply@anthropic.com>
</commit_message>
<xml_diff>
--- a/docs/06-architecture/ZP-DOC-06_Architecture.docx
+++ b/docs/06-architecture/ZP-DOC-06_Architecture.docx
@@ -1567,6 +1567,122 @@
           </w:p>
         </w:tc>
       </w:tr>
+      <w:tr>
+        <w:tblPrEx>
+          <w:tblCellMar>
+            <w:top w:w="0" w:type="dxa"/>
+            <w:bottom w:w="0" w:type="dxa"/>
+          </w:tblCellMar>
+        </w:tblPrEx>
+        <w:trPr>
+          <w:cantSplit/>
+          <w:trHeight w:val="420"/>
+        </w:trPr>
+        <w:tc>
+          <w:tcPr>
+            <w:tcW w:w="964" w:type="dxa"/>
+            <w:tcBorders>
+              <w:top w:val="single" w:sz="4" w:space="0" w:color="C9D3D0"/>
+              <w:left w:val="single" w:sz="4" w:space="0" w:color="C9D3D0"/>
+              <w:bottom w:val="single" w:sz="4" w:space="0" w:color="C9D3D0"/>
+              <w:right w:val="single" w:sz="4" w:space="0" w:color="C9D3D0"/>
+            </w:tcBorders>
+            <w:tcMar>
+              <w:top w:w="50" w:type="dxa"/>
+              <w:left w:w="100" w:type="dxa"/>
+              <w:bottom w:w="50" w:type="dxa"/>
+              <w:right w:w="100" w:type="dxa"/>
+            </w:tcMar>
+          </w:tcPr>
+          <w:p>
+            <w:r>
+              <w:rPr>
+                <w:sz w:val="19"/>
+                <w:szCs w:val="19"/>
+              </w:rPr>
+              <w:t>0.9</w:t>
+            </w:r>
+          </w:p>
+        </w:tc>
+        <w:tc>
+          <w:tcPr>
+            <w:tcW w:w="1542" w:type="dxa"/>
+            <w:tcBorders>
+              <w:top w:val="single" w:sz="4" w:space="0" w:color="C9D3D0"/>
+              <w:left w:val="single" w:sz="4" w:space="0" w:color="C9D3D0"/>
+              <w:bottom w:val="single" w:sz="4" w:space="0" w:color="C9D3D0"/>
+              <w:right w:val="single" w:sz="4" w:space="0" w:color="C9D3D0"/>
+            </w:tcBorders>
+            <w:tcMar>
+              <w:top w:w="50" w:type="dxa"/>
+              <w:left w:w="100" w:type="dxa"/>
+              <w:bottom w:w="50" w:type="dxa"/>
+              <w:right w:w="100" w:type="dxa"/>
+            </w:tcMar>
+          </w:tcPr>
+          <w:p>
+            <w:r>
+              <w:rPr>
+                <w:sz w:val="19"/>
+                <w:szCs w:val="19"/>
+              </w:rPr>
+              <w:t>24 Oct 2026</w:t>
+            </w:r>
+          </w:p>
+        </w:tc>
+        <w:tc>
+          <w:tcPr>
+            <w:tcW w:w="1928" w:type="dxa"/>
+            <w:tcBorders>
+              <w:top w:val="single" w:sz="4" w:space="0" w:color="C9D3D0"/>
+              <w:left w:val="single" w:sz="4" w:space="0" w:color="C9D3D0"/>
+              <w:bottom w:val="single" w:sz="4" w:space="0" w:color="C9D3D0"/>
+              <w:right w:val="single" w:sz="4" w:space="0" w:color="C9D3D0"/>
+            </w:tcBorders>
+            <w:tcMar>
+              <w:top w:w="50" w:type="dxa"/>
+              <w:left w:w="100" w:type="dxa"/>
+              <w:bottom w:w="50" w:type="dxa"/>
+              <w:right w:w="100" w:type="dxa"/>
+            </w:tcMar>
+          </w:tcPr>
+          <w:p>
+            <w:r>
+              <w:rPr>
+                <w:sz w:val="19"/>
+                <w:szCs w:val="19"/>
+              </w:rPr>
+              <w:t>Team Kestrel</w:t>
+            </w:r>
+          </w:p>
+        </w:tc>
+        <w:tc>
+          <w:tcPr>
+            <w:tcW w:w="5204" w:type="dxa"/>
+            <w:tcBorders>
+              <w:top w:val="single" w:sz="4" w:space="0" w:color="C9D3D0"/>
+              <w:left w:val="single" w:sz="4" w:space="0" w:color="C9D3D0"/>
+              <w:bottom w:val="single" w:sz="4" w:space="0" w:color="C9D3D0"/>
+              <w:right w:val="single" w:sz="4" w:space="0" w:color="C9D3D0"/>
+            </w:tcBorders>
+            <w:tcMar>
+              <w:top w:w="50" w:type="dxa"/>
+              <w:left w:w="100" w:type="dxa"/>
+              <w:bottom w:w="50" w:type="dxa"/>
+              <w:right w:w="100" w:type="dxa"/>
+            </w:tcMar>
+          </w:tcPr>
+          <w:p>
+            <w:r>
+              <w:rPr>
+                <w:sz w:val="19"/>
+                <w:szCs w:val="19"/>
+              </w:rPr>
+              <w:t>Ask: Claude Haiku 5.5 answers first through AI Gateway when ANTHROPIC_API_KEY is set; Gemini chain kept as fallback (ASK-048 to ASK-051)</w:t>
+            </w:r>
+          </w:p>
+        </w:tc>
+      </w:tr>
     </w:tbl>
     <w:p>
       <w:pPr>
@@ -1881,6 +1997,7 @@
                 <w:sz w:val="19"/>
                 <w:szCs w:val="19"/>
               </w:rPr>
+              <w:lastRenderedPageBreak/>
               <w:t>Approver</w:t>
             </w:r>
           </w:p>
@@ -1966,7 +2083,7 @@
     <w:sdt>
       <w:sdtPr>
         <w:alias w:val="Contents"/>
-        <w:id w:val="-1207411546"/>
+        <w:id w:val="-1697374284"/>
       </w:sdtPr>
       <w:sdtEndPr/>
       <w:sdtContent>
@@ -1995,7 +2112,7 @@
           <w:r>
             <w:fldChar w:fldCharType="separate"/>
           </w:r>
-          <w:hyperlink w:anchor="_Toc242920454" w:history="1">
+          <w:hyperlink w:anchor="_Toc243739276" w:history="1">
             <w:r>
               <w:rPr>
                 <w:rStyle w:val="Hyperlink"/>
@@ -2019,7 +2136,7 @@
               <w:rPr>
                 <w:noProof/>
               </w:rPr>
-              <w:instrText xml:space="preserve"> PAGEREF _Toc242920454 \h </w:instrText>
+              <w:instrText xml:space="preserve"> PAGEREF _Toc243739276 \h </w:instrText>
             </w:r>
             <w:r>
               <w:rPr>
@@ -2036,7 +2153,7 @@
               <w:rPr>
                 <w:noProof/>
               </w:rPr>
-              <w:t>5</w:t>
+              <w:t>6</w:t>
             </w:r>
             <w:r>
               <w:rPr>
@@ -2062,7 +2179,7 @@
               <w14:ligatures w14:val="standardContextual"/>
             </w:rPr>
           </w:pPr>
-          <w:hyperlink w:anchor="_Toc242920455" w:history="1">
+          <w:hyperlink w:anchor="_Toc243739277" w:history="1">
             <w:r>
               <w:rPr>
                 <w:rStyle w:val="Hyperlink"/>
@@ -2086,7 +2203,7 @@
               <w:rPr>
                 <w:noProof/>
               </w:rPr>
-              <w:instrText xml:space="preserve"> PAGEREF _Toc242920455 \h </w:instrText>
+              <w:instrText xml:space="preserve"> PAGEREF _Toc243739277 \h </w:instrText>
             </w:r>
             <w:r>
               <w:rPr>
@@ -2103,7 +2220,7 @@
               <w:rPr>
                 <w:noProof/>
               </w:rPr>
-              <w:t>5</w:t>
+              <w:t>6</w:t>
             </w:r>
             <w:r>
               <w:rPr>
@@ -2129,7 +2246,7 @@
               <w14:ligatures w14:val="standardContextual"/>
             </w:rPr>
           </w:pPr>
-          <w:hyperlink w:anchor="_Toc242920456" w:history="1">
+          <w:hyperlink w:anchor="_Toc243739278" w:history="1">
             <w:r>
               <w:rPr>
                 <w:rStyle w:val="Hyperlink"/>
@@ -2153,7 +2270,7 @@
               <w:rPr>
                 <w:noProof/>
               </w:rPr>
-              <w:instrText xml:space="preserve"> PAGEREF _Toc242920456 \h </w:instrText>
+              <w:instrText xml:space="preserve"> PAGEREF _Toc243739278 \h </w:instrText>
             </w:r>
             <w:r>
               <w:rPr>
@@ -2170,7 +2287,7 @@
               <w:rPr>
                 <w:noProof/>
               </w:rPr>
-              <w:t>5</w:t>
+              <w:t>6</w:t>
             </w:r>
             <w:r>
               <w:rPr>
@@ -2196,7 +2313,7 @@
               <w14:ligatures w14:val="standardContextual"/>
             </w:rPr>
           </w:pPr>
-          <w:hyperlink w:anchor="_Toc242920457" w:history="1">
+          <w:hyperlink w:anchor="_Toc243739279" w:history="1">
             <w:r>
               <w:rPr>
                 <w:rStyle w:val="Hyperlink"/>
@@ -2220,7 +2337,7 @@
               <w:rPr>
                 <w:noProof/>
               </w:rPr>
-              <w:instrText xml:space="preserve"> PAGEREF _Toc242920457 \h </w:instrText>
+              <w:instrText xml:space="preserve"> PAGEREF _Toc243739279 \h </w:instrText>
             </w:r>
             <w:r>
               <w:rPr>
@@ -2237,7 +2354,7 @@
               <w:rPr>
                 <w:noProof/>
               </w:rPr>
-              <w:t>5</w:t>
+              <w:t>6</w:t>
             </w:r>
             <w:r>
               <w:rPr>
@@ -2263,7 +2380,7 @@
               <w14:ligatures w14:val="standardContextual"/>
             </w:rPr>
           </w:pPr>
-          <w:hyperlink w:anchor="_Toc242920458" w:history="1">
+          <w:hyperlink w:anchor="_Toc243739280" w:history="1">
             <w:r>
               <w:rPr>
                 <w:rStyle w:val="Hyperlink"/>
@@ -2287,7 +2404,7 @@
               <w:rPr>
                 <w:noProof/>
               </w:rPr>
-              <w:instrText xml:space="preserve"> PAGEREF _Toc242920458 \h </w:instrText>
+              <w:instrText xml:space="preserve"> PAGEREF _Toc243739280 \h </w:instrText>
             </w:r>
             <w:r>
               <w:rPr>
@@ -2304,7 +2421,7 @@
               <w:rPr>
                 <w:noProof/>
               </w:rPr>
-              <w:t>5</w:t>
+              <w:t>6</w:t>
             </w:r>
             <w:r>
               <w:rPr>
@@ -2330,7 +2447,7 @@
               <w14:ligatures w14:val="standardContextual"/>
             </w:rPr>
           </w:pPr>
-          <w:hyperlink w:anchor="_Toc242920459" w:history="1">
+          <w:hyperlink w:anchor="_Toc243739281" w:history="1">
             <w:r>
               <w:rPr>
                 <w:rStyle w:val="Hyperlink"/>
@@ -2354,7 +2471,7 @@
               <w:rPr>
                 <w:noProof/>
               </w:rPr>
-              <w:instrText xml:space="preserve"> PAGEREF _Toc242920459 \h </w:instrText>
+              <w:instrText xml:space="preserve"> PAGEREF _Toc243739281 \h </w:instrText>
             </w:r>
             <w:r>
               <w:rPr>
@@ -2371,7 +2488,7 @@
               <w:rPr>
                 <w:noProof/>
               </w:rPr>
-              <w:t>6</w:t>
+              <w:t>7</w:t>
             </w:r>
             <w:r>
               <w:rPr>
@@ -2397,7 +2514,7 @@
               <w14:ligatures w14:val="standardContextual"/>
             </w:rPr>
           </w:pPr>
-          <w:hyperlink w:anchor="_Toc242920460" w:history="1">
+          <w:hyperlink w:anchor="_Toc243739282" w:history="1">
             <w:r>
               <w:rPr>
                 <w:rStyle w:val="Hyperlink"/>
@@ -2421,7 +2538,7 @@
               <w:rPr>
                 <w:noProof/>
               </w:rPr>
-              <w:instrText xml:space="preserve"> PAGEREF _Toc242920460 \h </w:instrText>
+              <w:instrText xml:space="preserve"> PAGEREF _Toc243739282 \h </w:instrText>
             </w:r>
             <w:r>
               <w:rPr>
@@ -2438,7 +2555,7 @@
               <w:rPr>
                 <w:noProof/>
               </w:rPr>
-              <w:t>6</w:t>
+              <w:t>7</w:t>
             </w:r>
             <w:r>
               <w:rPr>
@@ -2464,7 +2581,7 @@
               <w14:ligatures w14:val="standardContextual"/>
             </w:rPr>
           </w:pPr>
-          <w:hyperlink w:anchor="_Toc242920461" w:history="1">
+          <w:hyperlink w:anchor="_Toc243739283" w:history="1">
             <w:r>
               <w:rPr>
                 <w:rStyle w:val="Hyperlink"/>
@@ -2488,7 +2605,7 @@
               <w:rPr>
                 <w:noProof/>
               </w:rPr>
-              <w:instrText xml:space="preserve"> PAGEREF _Toc242920461 \h </w:instrText>
+              <w:instrText xml:space="preserve"> PAGEREF _Toc243739283 \h </w:instrText>
             </w:r>
             <w:r>
               <w:rPr>
@@ -2505,7 +2622,7 @@
               <w:rPr>
                 <w:noProof/>
               </w:rPr>
-              <w:t>6</w:t>
+              <w:t>7</w:t>
             </w:r>
             <w:r>
               <w:rPr>
@@ -2531,7 +2648,7 @@
               <w14:ligatures w14:val="standardContextual"/>
             </w:rPr>
           </w:pPr>
-          <w:hyperlink w:anchor="_Toc242920462" w:history="1">
+          <w:hyperlink w:anchor="_Toc243739284" w:history="1">
             <w:r>
               <w:rPr>
                 <w:rStyle w:val="Hyperlink"/>
@@ -2555,7 +2672,7 @@
               <w:rPr>
                 <w:noProof/>
               </w:rPr>
-              <w:instrText xml:space="preserve"> PAGEREF _Toc242920462 \h </w:instrText>
+              <w:instrText xml:space="preserve"> PAGEREF _Toc243739284 \h </w:instrText>
             </w:r>
             <w:r>
               <w:rPr>
@@ -2572,7 +2689,7 @@
               <w:rPr>
                 <w:noProof/>
               </w:rPr>
-              <w:t>8</w:t>
+              <w:t>9</w:t>
             </w:r>
             <w:r>
               <w:rPr>
@@ -2598,7 +2715,7 @@
               <w14:ligatures w14:val="standardContextual"/>
             </w:rPr>
           </w:pPr>
-          <w:hyperlink w:anchor="_Toc242920463" w:history="1">
+          <w:hyperlink w:anchor="_Toc243739285" w:history="1">
             <w:r>
               <w:rPr>
                 <w:rStyle w:val="Hyperlink"/>
@@ -2622,7 +2739,7 @@
               <w:rPr>
                 <w:noProof/>
               </w:rPr>
-              <w:instrText xml:space="preserve"> PAGEREF _Toc242920463 \h </w:instrText>
+              <w:instrText xml:space="preserve"> PAGEREF _Toc243739285 \h </w:instrText>
             </w:r>
             <w:r>
               <w:rPr>
@@ -2639,7 +2756,7 @@
               <w:rPr>
                 <w:noProof/>
               </w:rPr>
-              <w:t>9</w:t>
+              <w:t>10</w:t>
             </w:r>
             <w:r>
               <w:rPr>
@@ -2665,7 +2782,7 @@
               <w14:ligatures w14:val="standardContextual"/>
             </w:rPr>
           </w:pPr>
-          <w:hyperlink w:anchor="_Toc242920464" w:history="1">
+          <w:hyperlink w:anchor="_Toc243739286" w:history="1">
             <w:r>
               <w:rPr>
                 <w:rStyle w:val="Hyperlink"/>
@@ -2689,7 +2806,7 @@
               <w:rPr>
                 <w:noProof/>
               </w:rPr>
-              <w:instrText xml:space="preserve"> PAGEREF _Toc242920464 \h </w:instrText>
+              <w:instrText xml:space="preserve"> PAGEREF _Toc243739286 \h </w:instrText>
             </w:r>
             <w:r>
               <w:rPr>
@@ -2706,7 +2823,7 @@
               <w:rPr>
                 <w:noProof/>
               </w:rPr>
-              <w:t>11</w:t>
+              <w:t>12</w:t>
             </w:r>
             <w:r>
               <w:rPr>
@@ -2732,7 +2849,7 @@
               <w14:ligatures w14:val="standardContextual"/>
             </w:rPr>
           </w:pPr>
-          <w:hyperlink w:anchor="_Toc242920465" w:history="1">
+          <w:hyperlink w:anchor="_Toc243739287" w:history="1">
             <w:r>
               <w:rPr>
                 <w:rStyle w:val="Hyperlink"/>
@@ -2756,7 +2873,7 @@
               <w:rPr>
                 <w:noProof/>
               </w:rPr>
-              <w:instrText xml:space="preserve"> PAGEREF _Toc242920465 \h </w:instrText>
+              <w:instrText xml:space="preserve"> PAGEREF _Toc243739287 \h </w:instrText>
             </w:r>
             <w:r>
               <w:rPr>
@@ -2773,7 +2890,7 @@
               <w:rPr>
                 <w:noProof/>
               </w:rPr>
-              <w:t>11</w:t>
+              <w:t>12</w:t>
             </w:r>
             <w:r>
               <w:rPr>
@@ -2799,7 +2916,7 @@
               <w14:ligatures w14:val="standardContextual"/>
             </w:rPr>
           </w:pPr>
-          <w:hyperlink w:anchor="_Toc242920466" w:history="1">
+          <w:hyperlink w:anchor="_Toc243739288" w:history="1">
             <w:r>
               <w:rPr>
                 <w:rStyle w:val="Hyperlink"/>
@@ -2823,7 +2940,7 @@
               <w:rPr>
                 <w:noProof/>
               </w:rPr>
-              <w:instrText xml:space="preserve"> PAGEREF _Toc242920466 \h </w:instrText>
+              <w:instrText xml:space="preserve"> PAGEREF _Toc243739288 \h </w:instrText>
             </w:r>
             <w:r>
               <w:rPr>
@@ -2840,7 +2957,7 @@
               <w:rPr>
                 <w:noProof/>
               </w:rPr>
-              <w:t>12</w:t>
+              <w:t>13</w:t>
             </w:r>
             <w:r>
               <w:rPr>
@@ -2866,7 +2983,7 @@
               <w14:ligatures w14:val="standardContextual"/>
             </w:rPr>
           </w:pPr>
-          <w:hyperlink w:anchor="_Toc242920467" w:history="1">
+          <w:hyperlink w:anchor="_Toc243739289" w:history="1">
             <w:r>
               <w:rPr>
                 <w:rStyle w:val="Hyperlink"/>
@@ -2890,7 +3007,7 @@
               <w:rPr>
                 <w:noProof/>
               </w:rPr>
-              <w:instrText xml:space="preserve"> PAGEREF _Toc242920467 \h </w:instrText>
+              <w:instrText xml:space="preserve"> PAGEREF _Toc243739289 \h </w:instrText>
             </w:r>
             <w:r>
               <w:rPr>
@@ -2907,7 +3024,7 @@
               <w:rPr>
                 <w:noProof/>
               </w:rPr>
-              <w:t>12</w:t>
+              <w:t>13</w:t>
             </w:r>
             <w:r>
               <w:rPr>
@@ -2933,7 +3050,7 @@
               <w14:ligatures w14:val="standardContextual"/>
             </w:rPr>
           </w:pPr>
-          <w:hyperlink w:anchor="_Toc242920468" w:history="1">
+          <w:hyperlink w:anchor="_Toc243739290" w:history="1">
             <w:r>
               <w:rPr>
                 <w:rStyle w:val="Hyperlink"/>
@@ -2957,7 +3074,7 @@
               <w:rPr>
                 <w:noProof/>
               </w:rPr>
-              <w:instrText xml:space="preserve"> PAGEREF _Toc242920468 \h </w:instrText>
+              <w:instrText xml:space="preserve"> PAGEREF _Toc243739290 \h </w:instrText>
             </w:r>
             <w:r>
               <w:rPr>
@@ -2974,7 +3091,7 @@
               <w:rPr>
                 <w:noProof/>
               </w:rPr>
-              <w:t>12</w:t>
+              <w:t>13</w:t>
             </w:r>
             <w:r>
               <w:rPr>
@@ -3000,7 +3117,7 @@
               <w14:ligatures w14:val="standardContextual"/>
             </w:rPr>
           </w:pPr>
-          <w:hyperlink w:anchor="_Toc242920469" w:history="1">
+          <w:hyperlink w:anchor="_Toc243739291" w:history="1">
             <w:r>
               <w:rPr>
                 <w:rStyle w:val="Hyperlink"/>
@@ -3024,7 +3141,7 @@
               <w:rPr>
                 <w:noProof/>
               </w:rPr>
-              <w:instrText xml:space="preserve"> PAGEREF _Toc242920469 \h </w:instrText>
+              <w:instrText xml:space="preserve"> PAGEREF _Toc243739291 \h </w:instrText>
             </w:r>
             <w:r>
               <w:rPr>
@@ -3041,7 +3158,7 @@
               <w:rPr>
                 <w:noProof/>
               </w:rPr>
-              <w:t>13</w:t>
+              <w:t>14</w:t>
             </w:r>
             <w:r>
               <w:rPr>
@@ -3067,7 +3184,7 @@
               <w14:ligatures w14:val="standardContextual"/>
             </w:rPr>
           </w:pPr>
-          <w:hyperlink w:anchor="_Toc242920470" w:history="1">
+          <w:hyperlink w:anchor="_Toc243739292" w:history="1">
             <w:r>
               <w:rPr>
                 <w:rStyle w:val="Hyperlink"/>
@@ -3091,7 +3208,7 @@
               <w:rPr>
                 <w:noProof/>
               </w:rPr>
-              <w:instrText xml:space="preserve"> PAGEREF _Toc242920470 \h </w:instrText>
+              <w:instrText xml:space="preserve"> PAGEREF _Toc243739292 \h </w:instrText>
             </w:r>
             <w:r>
               <w:rPr>
@@ -3108,7 +3225,7 @@
               <w:rPr>
                 <w:noProof/>
               </w:rPr>
-              <w:t>13</w:t>
+              <w:t>14</w:t>
             </w:r>
             <w:r>
               <w:rPr>
@@ -3134,7 +3251,7 @@
               <w14:ligatures w14:val="standardContextual"/>
             </w:rPr>
           </w:pPr>
-          <w:hyperlink w:anchor="_Toc242920471" w:history="1">
+          <w:hyperlink w:anchor="_Toc243739293" w:history="1">
             <w:r>
               <w:rPr>
                 <w:rStyle w:val="Hyperlink"/>
@@ -3158,7 +3275,7 @@
               <w:rPr>
                 <w:noProof/>
               </w:rPr>
-              <w:instrText xml:space="preserve"> PAGEREF _Toc242920471 \h </w:instrText>
+              <w:instrText xml:space="preserve"> PAGEREF _Toc243739293 \h </w:instrText>
             </w:r>
             <w:r>
               <w:rPr>
@@ -3175,7 +3292,7 @@
               <w:rPr>
                 <w:noProof/>
               </w:rPr>
-              <w:t>13</w:t>
+              <w:t>14</w:t>
             </w:r>
             <w:r>
               <w:rPr>
@@ -3201,7 +3318,7 @@
               <w14:ligatures w14:val="standardContextual"/>
             </w:rPr>
           </w:pPr>
-          <w:hyperlink w:anchor="_Toc242920472" w:history="1">
+          <w:hyperlink w:anchor="_Toc243739294" w:history="1">
             <w:r>
               <w:rPr>
                 <w:rStyle w:val="Hyperlink"/>
@@ -3225,7 +3342,7 @@
               <w:rPr>
                 <w:noProof/>
               </w:rPr>
-              <w:instrText xml:space="preserve"> PAGEREF _Toc242920472 \h </w:instrText>
+              <w:instrText xml:space="preserve"> PAGEREF _Toc243739294 \h </w:instrText>
             </w:r>
             <w:r>
               <w:rPr>
@@ -3242,7 +3359,7 @@
               <w:rPr>
                 <w:noProof/>
               </w:rPr>
-              <w:t>14</w:t>
+              <w:t>15</w:t>
             </w:r>
             <w:r>
               <w:rPr>
@@ -3268,7 +3385,7 @@
               <w14:ligatures w14:val="standardContextual"/>
             </w:rPr>
           </w:pPr>
-          <w:hyperlink w:anchor="_Toc242920473" w:history="1">
+          <w:hyperlink w:anchor="_Toc243739295" w:history="1">
             <w:r>
               <w:rPr>
                 <w:rStyle w:val="Hyperlink"/>
@@ -3292,7 +3409,7 @@
               <w:rPr>
                 <w:noProof/>
               </w:rPr>
-              <w:instrText xml:space="preserve"> PAGEREF _Toc242920473 \h </w:instrText>
+              <w:instrText xml:space="preserve"> PAGEREF _Toc243739295 \h </w:instrText>
             </w:r>
             <w:r>
               <w:rPr>
@@ -3309,7 +3426,7 @@
               <w:rPr>
                 <w:noProof/>
               </w:rPr>
-              <w:t>14</w:t>
+              <w:t>15</w:t>
             </w:r>
             <w:r>
               <w:rPr>
@@ -3335,7 +3452,7 @@
               <w14:ligatures w14:val="standardContextual"/>
             </w:rPr>
           </w:pPr>
-          <w:hyperlink w:anchor="_Toc242920474" w:history="1">
+          <w:hyperlink w:anchor="_Toc243739296" w:history="1">
             <w:r>
               <w:rPr>
                 <w:rStyle w:val="Hyperlink"/>
@@ -3359,7 +3476,7 @@
               <w:rPr>
                 <w:noProof/>
               </w:rPr>
-              <w:instrText xml:space="preserve"> PAGEREF _Toc242920474 \h </w:instrText>
+              <w:instrText xml:space="preserve"> PAGEREF _Toc243739296 \h </w:instrText>
             </w:r>
             <w:r>
               <w:rPr>
@@ -3376,7 +3493,7 @@
               <w:rPr>
                 <w:noProof/>
               </w:rPr>
-              <w:t>14</w:t>
+              <w:t>15</w:t>
             </w:r>
             <w:r>
               <w:rPr>
@@ -3402,7 +3519,7 @@
               <w14:ligatures w14:val="standardContextual"/>
             </w:rPr>
           </w:pPr>
-          <w:hyperlink w:anchor="_Toc242920475" w:history="1">
+          <w:hyperlink w:anchor="_Toc243739297" w:history="1">
             <w:r>
               <w:rPr>
                 <w:rStyle w:val="Hyperlink"/>
@@ -3426,7 +3543,7 @@
               <w:rPr>
                 <w:noProof/>
               </w:rPr>
-              <w:instrText xml:space="preserve"> PAGEREF _Toc242920475 \h </w:instrText>
+              <w:instrText xml:space="preserve"> PAGEREF _Toc243739297 \h </w:instrText>
             </w:r>
             <w:r>
               <w:rPr>
@@ -3443,7 +3560,7 @@
               <w:rPr>
                 <w:noProof/>
               </w:rPr>
-              <w:t>14</w:t>
+              <w:t>15</w:t>
             </w:r>
             <w:r>
               <w:rPr>
@@ -3469,7 +3586,7 @@
               <w14:ligatures w14:val="standardContextual"/>
             </w:rPr>
           </w:pPr>
-          <w:hyperlink w:anchor="_Toc242920476" w:history="1">
+          <w:hyperlink w:anchor="_Toc243739298" w:history="1">
             <w:r>
               <w:rPr>
                 <w:rStyle w:val="Hyperlink"/>
@@ -3493,7 +3610,7 @@
               <w:rPr>
                 <w:noProof/>
               </w:rPr>
-              <w:instrText xml:space="preserve"> PAGEREF _Toc242920476 \h </w:instrText>
+              <w:instrText xml:space="preserve"> PAGEREF _Toc243739298 \h </w:instrText>
             </w:r>
             <w:r>
               <w:rPr>
@@ -3510,7 +3627,7 @@
               <w:rPr>
                 <w:noProof/>
               </w:rPr>
-              <w:t>15</w:t>
+              <w:t>16</w:t>
             </w:r>
             <w:r>
               <w:rPr>
@@ -3536,7 +3653,7 @@
               <w14:ligatures w14:val="standardContextual"/>
             </w:rPr>
           </w:pPr>
-          <w:hyperlink w:anchor="_Toc242920477" w:history="1">
+          <w:hyperlink w:anchor="_Toc243739299" w:history="1">
             <w:r>
               <w:rPr>
                 <w:rStyle w:val="Hyperlink"/>
@@ -3560,7 +3677,7 @@
               <w:rPr>
                 <w:noProof/>
               </w:rPr>
-              <w:instrText xml:space="preserve"> PAGEREF _Toc242920477 \h </w:instrText>
+              <w:instrText xml:space="preserve"> PAGEREF _Toc243739299 \h </w:instrText>
             </w:r>
             <w:r>
               <w:rPr>
@@ -3577,7 +3694,7 @@
               <w:rPr>
                 <w:noProof/>
               </w:rPr>
-              <w:t>16</w:t>
+              <w:t>17</w:t>
             </w:r>
             <w:r>
               <w:rPr>
@@ -3603,7 +3720,7 @@
               <w14:ligatures w14:val="standardContextual"/>
             </w:rPr>
           </w:pPr>
-          <w:hyperlink w:anchor="_Toc242920478" w:history="1">
+          <w:hyperlink w:anchor="_Toc243739300" w:history="1">
             <w:r>
               <w:rPr>
                 <w:rStyle w:val="Hyperlink"/>
@@ -3627,7 +3744,7 @@
               <w:rPr>
                 <w:noProof/>
               </w:rPr>
-              <w:instrText xml:space="preserve"> PAGEREF _Toc242920478 \h </w:instrText>
+              <w:instrText xml:space="preserve"> PAGEREF _Toc243739300 \h </w:instrText>
             </w:r>
             <w:r>
               <w:rPr>
@@ -3644,7 +3761,7 @@
               <w:rPr>
                 <w:noProof/>
               </w:rPr>
-              <w:t>18</w:t>
+              <w:t>19</w:t>
             </w:r>
             <w:r>
               <w:rPr>
@@ -3670,7 +3787,7 @@
               <w14:ligatures w14:val="standardContextual"/>
             </w:rPr>
           </w:pPr>
-          <w:hyperlink w:anchor="_Toc242920479" w:history="1">
+          <w:hyperlink w:anchor="_Toc243739301" w:history="1">
             <w:r>
               <w:rPr>
                 <w:rStyle w:val="Hyperlink"/>
@@ -3694,7 +3811,7 @@
               <w:rPr>
                 <w:noProof/>
               </w:rPr>
-              <w:instrText xml:space="preserve"> PAGEREF _Toc242920479 \h </w:instrText>
+              <w:instrText xml:space="preserve"> PAGEREF _Toc243739301 \h </w:instrText>
             </w:r>
             <w:r>
               <w:rPr>
@@ -3711,7 +3828,7 @@
               <w:rPr>
                 <w:noProof/>
               </w:rPr>
-              <w:t>19</w:t>
+              <w:t>20</w:t>
             </w:r>
             <w:r>
               <w:rPr>
@@ -3737,7 +3854,7 @@
               <w14:ligatures w14:val="standardContextual"/>
             </w:rPr>
           </w:pPr>
-          <w:hyperlink w:anchor="_Toc242920480" w:history="1">
+          <w:hyperlink w:anchor="_Toc243739302" w:history="1">
             <w:r>
               <w:rPr>
                 <w:rStyle w:val="Hyperlink"/>
@@ -3761,7 +3878,7 @@
               <w:rPr>
                 <w:noProof/>
               </w:rPr>
-              <w:instrText xml:space="preserve"> PAGEREF _Toc242920480 \h </w:instrText>
+              <w:instrText xml:space="preserve"> PAGEREF _Toc243739302 \h </w:instrText>
             </w:r>
             <w:r>
               <w:rPr>
@@ -3778,7 +3895,7 @@
               <w:rPr>
                 <w:noProof/>
               </w:rPr>
-              <w:t>22</w:t>
+              <w:t>23</w:t>
             </w:r>
             <w:r>
               <w:rPr>
@@ -3804,7 +3921,7 @@
               <w14:ligatures w14:val="standardContextual"/>
             </w:rPr>
           </w:pPr>
-          <w:hyperlink w:anchor="_Toc242920481" w:history="1">
+          <w:hyperlink w:anchor="_Toc243739303" w:history="1">
             <w:r>
               <w:rPr>
                 <w:rStyle w:val="Hyperlink"/>
@@ -3828,7 +3945,7 @@
               <w:rPr>
                 <w:noProof/>
               </w:rPr>
-              <w:instrText xml:space="preserve"> PAGEREF _Toc242920481 \h </w:instrText>
+              <w:instrText xml:space="preserve"> PAGEREF _Toc243739303 \h </w:instrText>
             </w:r>
             <w:r>
               <w:rPr>
@@ -3845,7 +3962,7 @@
               <w:rPr>
                 <w:noProof/>
               </w:rPr>
-              <w:t>23</w:t>
+              <w:t>24</w:t>
             </w:r>
             <w:r>
               <w:rPr>
@@ -3871,7 +3988,7 @@
               <w14:ligatures w14:val="standardContextual"/>
             </w:rPr>
           </w:pPr>
-          <w:hyperlink w:anchor="_Toc242920482" w:history="1">
+          <w:hyperlink w:anchor="_Toc243739304" w:history="1">
             <w:r>
               <w:rPr>
                 <w:rStyle w:val="Hyperlink"/>
@@ -3895,7 +4012,7 @@
               <w:rPr>
                 <w:noProof/>
               </w:rPr>
-              <w:instrText xml:space="preserve"> PAGEREF _Toc242920482 \h </w:instrText>
+              <w:instrText xml:space="preserve"> PAGEREF _Toc243739304 \h </w:instrText>
             </w:r>
             <w:r>
               <w:rPr>
@@ -3912,7 +4029,7 @@
               <w:rPr>
                 <w:noProof/>
               </w:rPr>
-              <w:t>24</w:t>
+              <w:t>25</w:t>
             </w:r>
             <w:r>
               <w:rPr>
@@ -3938,7 +4055,7 @@
               <w14:ligatures w14:val="standardContextual"/>
             </w:rPr>
           </w:pPr>
-          <w:hyperlink w:anchor="_Toc242920483" w:history="1">
+          <w:hyperlink w:anchor="_Toc243739305" w:history="1">
             <w:r>
               <w:rPr>
                 <w:rStyle w:val="Hyperlink"/>
@@ -3962,7 +4079,7 @@
               <w:rPr>
                 <w:noProof/>
               </w:rPr>
-              <w:instrText xml:space="preserve"> PAGEREF _Toc242920483 \h </w:instrText>
+              <w:instrText xml:space="preserve"> PAGEREF _Toc243739305 \h </w:instrText>
             </w:r>
             <w:r>
               <w:rPr>
@@ -3979,7 +4096,7 @@
               <w:rPr>
                 <w:noProof/>
               </w:rPr>
-              <w:t>25</w:t>
+              <w:t>26</w:t>
             </w:r>
             <w:r>
               <w:rPr>
@@ -4005,7 +4122,7 @@
               <w14:ligatures w14:val="standardContextual"/>
             </w:rPr>
           </w:pPr>
-          <w:hyperlink w:anchor="_Toc242920484" w:history="1">
+          <w:hyperlink w:anchor="_Toc243739306" w:history="1">
             <w:r>
               <w:rPr>
                 <w:rStyle w:val="Hyperlink"/>
@@ -4029,7 +4146,7 @@
               <w:rPr>
                 <w:noProof/>
               </w:rPr>
-              <w:instrText xml:space="preserve"> PAGEREF _Toc242920484 \h </w:instrText>
+              <w:instrText xml:space="preserve"> PAGEREF _Toc243739306 \h </w:instrText>
             </w:r>
             <w:r>
               <w:rPr>
@@ -4046,7 +4163,7 @@
               <w:rPr>
                 <w:noProof/>
               </w:rPr>
-              <w:t>26</w:t>
+              <w:t>27</w:t>
             </w:r>
             <w:r>
               <w:rPr>
@@ -4075,7 +4192,7 @@
     <w:sdt>
       <w:sdtPr>
         <w:alias w:val="Figures"/>
-        <w:id w:val="-1806683714"/>
+        <w:id w:val="-1830736706"/>
       </w:sdtPr>
       <w:sdtEndPr/>
       <w:sdtContent>
@@ -4104,7 +4221,7 @@
           <w:r>
             <w:fldChar w:fldCharType="separate"/>
           </w:r>
-          <w:hyperlink w:anchor="_Toc242920485" w:history="1">
+          <w:hyperlink w:anchor="_Toc243739307" w:history="1">
             <w:r>
               <w:rPr>
                 <w:rStyle w:val="Hyperlink"/>
@@ -4128,7 +4245,7 @@
               <w:rPr>
                 <w:noProof/>
               </w:rPr>
-              <w:instrText xml:space="preserve"> PAGEREF _Toc242920485 \h </w:instrText>
+              <w:instrText xml:space="preserve"> PAGEREF _Toc243739307 \h </w:instrText>
             </w:r>
             <w:r>
               <w:rPr>
@@ -4145,7 +4262,7 @@
               <w:rPr>
                 <w:noProof/>
               </w:rPr>
-              <w:t>9</w:t>
+              <w:t>10</w:t>
             </w:r>
             <w:r>
               <w:rPr>
@@ -4171,7 +4288,7 @@
               <w14:ligatures w14:val="standardContextual"/>
             </w:rPr>
           </w:pPr>
-          <w:hyperlink w:anchor="_Toc242920486" w:history="1">
+          <w:hyperlink w:anchor="_Toc243739308" w:history="1">
             <w:r>
               <w:rPr>
                 <w:rStyle w:val="Hyperlink"/>
@@ -4195,7 +4312,7 @@
               <w:rPr>
                 <w:noProof/>
               </w:rPr>
-              <w:instrText xml:space="preserve"> PAGEREF _Toc242920486 \h </w:instrText>
+              <w:instrText xml:space="preserve"> PAGEREF _Toc243739308 \h </w:instrText>
             </w:r>
             <w:r>
               <w:rPr>
@@ -4212,7 +4329,7 @@
               <w:rPr>
                 <w:noProof/>
               </w:rPr>
-              <w:t>13</w:t>
+              <w:t>14</w:t>
             </w:r>
             <w:r>
               <w:rPr>
@@ -4242,7 +4359,7 @@
     <w:sdt>
       <w:sdtPr>
         <w:alias w:val="Tables"/>
-        <w:id w:val="-1486778152"/>
+        <w:id w:val="-704185227"/>
       </w:sdtPr>
       <w:sdtEndPr/>
       <w:sdtContent>
@@ -4271,7 +4388,7 @@
           <w:r>
             <w:fldChar w:fldCharType="separate"/>
           </w:r>
-          <w:hyperlink w:anchor="_Toc242920487" w:history="1">
+          <w:hyperlink w:anchor="_Toc243739309" w:history="1">
             <w:r>
               <w:rPr>
                 <w:rStyle w:val="Hyperlink"/>
@@ -4295,7 +4412,7 @@
               <w:rPr>
                 <w:noProof/>
               </w:rPr>
-              <w:instrText xml:space="preserve"> PAGEREF _Toc242920487 \h </w:instrText>
+              <w:instrText xml:space="preserve"> PAGEREF _Toc243739309 \h </w:instrText>
             </w:r>
             <w:r>
               <w:rPr>
@@ -4312,7 +4429,7 @@
               <w:rPr>
                 <w:noProof/>
               </w:rPr>
-              <w:t>5</w:t>
+              <w:t>6</w:t>
             </w:r>
             <w:r>
               <w:rPr>
@@ -4338,7 +4455,7 @@
               <w14:ligatures w14:val="standardContextual"/>
             </w:rPr>
           </w:pPr>
-          <w:hyperlink w:anchor="_Toc242920488" w:history="1">
+          <w:hyperlink w:anchor="_Toc243739310" w:history="1">
             <w:r>
               <w:rPr>
                 <w:rStyle w:val="Hyperlink"/>
@@ -4362,7 +4479,7 @@
               <w:rPr>
                 <w:noProof/>
               </w:rPr>
-              <w:instrText xml:space="preserve"> PAGEREF _Toc242920488 \h </w:instrText>
+              <w:instrText xml:space="preserve"> PAGEREF _Toc243739310 \h </w:instrText>
             </w:r>
             <w:r>
               <w:rPr>
@@ -4379,7 +4496,7 @@
               <w:rPr>
                 <w:noProof/>
               </w:rPr>
-              <w:t>6</w:t>
+              <w:t>7</w:t>
             </w:r>
             <w:r>
               <w:rPr>
@@ -4405,7 +4522,7 @@
               <w14:ligatures w14:val="standardContextual"/>
             </w:rPr>
           </w:pPr>
-          <w:hyperlink w:anchor="_Toc242920489" w:history="1">
+          <w:hyperlink w:anchor="_Toc243739311" w:history="1">
             <w:r>
               <w:rPr>
                 <w:rStyle w:val="Hyperlink"/>
@@ -4429,7 +4546,7 @@
               <w:rPr>
                 <w:noProof/>
               </w:rPr>
-              <w:instrText xml:space="preserve"> PAGEREF _Toc242920489 \h </w:instrText>
+              <w:instrText xml:space="preserve"> PAGEREF _Toc243739311 \h </w:instrText>
             </w:r>
             <w:r>
               <w:rPr>
@@ -4446,7 +4563,7 @@
               <w:rPr>
                 <w:noProof/>
               </w:rPr>
-              <w:t>6</w:t>
+              <w:t>7</w:t>
             </w:r>
             <w:r>
               <w:rPr>
@@ -4472,7 +4589,7 @@
               <w14:ligatures w14:val="standardContextual"/>
             </w:rPr>
           </w:pPr>
-          <w:hyperlink w:anchor="_Toc242920490" w:history="1">
+          <w:hyperlink w:anchor="_Toc243739312" w:history="1">
             <w:r>
               <w:rPr>
                 <w:rStyle w:val="Hyperlink"/>
@@ -4496,7 +4613,7 @@
               <w:rPr>
                 <w:noProof/>
               </w:rPr>
-              <w:instrText xml:space="preserve"> PAGEREF _Toc242920490 \h </w:instrText>
+              <w:instrText xml:space="preserve"> PAGEREF _Toc243739312 \h </w:instrText>
             </w:r>
             <w:r>
               <w:rPr>
@@ -4513,7 +4630,7 @@
               <w:rPr>
                 <w:noProof/>
               </w:rPr>
-              <w:t>8</w:t>
+              <w:t>9</w:t>
             </w:r>
             <w:r>
               <w:rPr>
@@ -4539,7 +4656,7 @@
               <w14:ligatures w14:val="standardContextual"/>
             </w:rPr>
           </w:pPr>
-          <w:hyperlink w:anchor="_Toc242920491" w:history="1">
+          <w:hyperlink w:anchor="_Toc243739313" w:history="1">
             <w:r>
               <w:rPr>
                 <w:rStyle w:val="Hyperlink"/>
@@ -4563,7 +4680,7 @@
               <w:rPr>
                 <w:noProof/>
               </w:rPr>
-              <w:instrText xml:space="preserve"> PAGEREF _Toc242920491 \h </w:instrText>
+              <w:instrText xml:space="preserve"> PAGEREF _Toc243739313 \h </w:instrText>
             </w:r>
             <w:r>
               <w:rPr>
@@ -4580,7 +4697,7 @@
               <w:rPr>
                 <w:noProof/>
               </w:rPr>
-              <w:t>9</w:t>
+              <w:t>10</w:t>
             </w:r>
             <w:r>
               <w:rPr>
@@ -4606,7 +4723,7 @@
               <w14:ligatures w14:val="standardContextual"/>
             </w:rPr>
           </w:pPr>
-          <w:hyperlink w:anchor="_Toc242920492" w:history="1">
+          <w:hyperlink w:anchor="_Toc243739314" w:history="1">
             <w:r>
               <w:rPr>
                 <w:rStyle w:val="Hyperlink"/>
@@ -4630,7 +4747,7 @@
               <w:rPr>
                 <w:noProof/>
               </w:rPr>
-              <w:instrText xml:space="preserve"> PAGEREF _Toc242920492 \h </w:instrText>
+              <w:instrText xml:space="preserve"> PAGEREF _Toc243739314 \h </w:instrText>
             </w:r>
             <w:r>
               <w:rPr>
@@ -4647,7 +4764,7 @@
               <w:rPr>
                 <w:noProof/>
               </w:rPr>
-              <w:t>11</w:t>
+              <w:t>12</w:t>
             </w:r>
             <w:r>
               <w:rPr>
@@ -4673,7 +4790,7 @@
               <w14:ligatures w14:val="standardContextual"/>
             </w:rPr>
           </w:pPr>
-          <w:hyperlink w:anchor="_Toc242920493" w:history="1">
+          <w:hyperlink w:anchor="_Toc243739315" w:history="1">
             <w:r>
               <w:rPr>
                 <w:rStyle w:val="Hyperlink"/>
@@ -4697,7 +4814,7 @@
               <w:rPr>
                 <w:noProof/>
               </w:rPr>
-              <w:instrText xml:space="preserve"> PAGEREF _Toc242920493 \h </w:instrText>
+              <w:instrText xml:space="preserve"> PAGEREF _Toc243739315 \h </w:instrText>
             </w:r>
             <w:r>
               <w:rPr>
@@ -4714,7 +4831,7 @@
               <w:rPr>
                 <w:noProof/>
               </w:rPr>
-              <w:t>16</w:t>
+              <w:t>17</w:t>
             </w:r>
             <w:r>
               <w:rPr>
@@ -4740,7 +4857,7 @@
               <w14:ligatures w14:val="standardContextual"/>
             </w:rPr>
           </w:pPr>
-          <w:hyperlink w:anchor="_Toc242920494" w:history="1">
+          <w:hyperlink w:anchor="_Toc243739316" w:history="1">
             <w:r>
               <w:rPr>
                 <w:rStyle w:val="Hyperlink"/>
@@ -4764,7 +4881,7 @@
               <w:rPr>
                 <w:noProof/>
               </w:rPr>
-              <w:instrText xml:space="preserve"> PAGEREF _Toc242920494 \h </w:instrText>
+              <w:instrText xml:space="preserve"> PAGEREF _Toc243739316 \h </w:instrText>
             </w:r>
             <w:r>
               <w:rPr>
@@ -4781,7 +4898,7 @@
               <w:rPr>
                 <w:noProof/>
               </w:rPr>
-              <w:t>18</w:t>
+              <w:t>19</w:t>
             </w:r>
             <w:r>
               <w:rPr>
@@ -4807,7 +4924,7 @@
               <w14:ligatures w14:val="standardContextual"/>
             </w:rPr>
           </w:pPr>
-          <w:hyperlink w:anchor="_Toc242920495" w:history="1">
+          <w:hyperlink w:anchor="_Toc243739317" w:history="1">
             <w:r>
               <w:rPr>
                 <w:rStyle w:val="Hyperlink"/>
@@ -4831,7 +4948,7 @@
               <w:rPr>
                 <w:noProof/>
               </w:rPr>
-              <w:instrText xml:space="preserve"> PAGEREF _Toc242920495 \h </w:instrText>
+              <w:instrText xml:space="preserve"> PAGEREF _Toc243739317 \h </w:instrText>
             </w:r>
             <w:r>
               <w:rPr>
@@ -4848,7 +4965,7 @@
               <w:rPr>
                 <w:noProof/>
               </w:rPr>
-              <w:t>19</w:t>
+              <w:t>20</w:t>
             </w:r>
             <w:r>
               <w:rPr>
@@ -4874,7 +4991,7 @@
               <w14:ligatures w14:val="standardContextual"/>
             </w:rPr>
           </w:pPr>
-          <w:hyperlink w:anchor="_Toc242920496" w:history="1">
+          <w:hyperlink w:anchor="_Toc243739318" w:history="1">
             <w:r>
               <w:rPr>
                 <w:rStyle w:val="Hyperlink"/>
@@ -4898,7 +5015,7 @@
               <w:rPr>
                 <w:noProof/>
               </w:rPr>
-              <w:instrText xml:space="preserve"> PAGEREF _Toc242920496 \h </w:instrText>
+              <w:instrText xml:space="preserve"> PAGEREF _Toc243739318 \h </w:instrText>
             </w:r>
             <w:r>
               <w:rPr>
@@ -4915,7 +5032,7 @@
               <w:rPr>
                 <w:noProof/>
               </w:rPr>
-              <w:t>19</w:t>
+              <w:t>20</w:t>
             </w:r>
             <w:r>
               <w:rPr>
@@ -4941,7 +5058,7 @@
               <w14:ligatures w14:val="standardContextual"/>
             </w:rPr>
           </w:pPr>
-          <w:hyperlink w:anchor="_Toc242920497" w:history="1">
+          <w:hyperlink w:anchor="_Toc243739319" w:history="1">
             <w:r>
               <w:rPr>
                 <w:rStyle w:val="Hyperlink"/>
@@ -4965,7 +5082,7 @@
               <w:rPr>
                 <w:noProof/>
               </w:rPr>
-              <w:instrText xml:space="preserve"> PAGEREF _Toc242920497 \h </w:instrText>
+              <w:instrText xml:space="preserve"> PAGEREF _Toc243739319 \h </w:instrText>
             </w:r>
             <w:r>
               <w:rPr>
@@ -4982,7 +5099,7 @@
               <w:rPr>
                 <w:noProof/>
               </w:rPr>
-              <w:t>19</w:t>
+              <w:t>20</w:t>
             </w:r>
             <w:r>
               <w:rPr>
@@ -5008,7 +5125,7 @@
               <w14:ligatures w14:val="standardContextual"/>
             </w:rPr>
           </w:pPr>
-          <w:hyperlink w:anchor="_Toc242920498" w:history="1">
+          <w:hyperlink w:anchor="_Toc243739320" w:history="1">
             <w:r>
               <w:rPr>
                 <w:rStyle w:val="Hyperlink"/>
@@ -5032,7 +5149,7 @@
               <w:rPr>
                 <w:noProof/>
               </w:rPr>
-              <w:instrText xml:space="preserve"> PAGEREF _Toc242920498 \h </w:instrText>
+              <w:instrText xml:space="preserve"> PAGEREF _Toc243739320 \h </w:instrText>
             </w:r>
             <w:r>
               <w:rPr>
@@ -5049,7 +5166,7 @@
               <w:rPr>
                 <w:noProof/>
               </w:rPr>
-              <w:t>19</w:t>
+              <w:t>20</w:t>
             </w:r>
             <w:r>
               <w:rPr>
@@ -5075,7 +5192,7 @@
               <w14:ligatures w14:val="standardContextual"/>
             </w:rPr>
           </w:pPr>
-          <w:hyperlink w:anchor="_Toc242920499" w:history="1">
+          <w:hyperlink w:anchor="_Toc243739321" w:history="1">
             <w:r>
               <w:rPr>
                 <w:rStyle w:val="Hyperlink"/>
@@ -5099,7 +5216,7 @@
               <w:rPr>
                 <w:noProof/>
               </w:rPr>
-              <w:instrText xml:space="preserve"> PAGEREF _Toc242920499 \h </w:instrText>
+              <w:instrText xml:space="preserve"> PAGEREF _Toc243739321 \h </w:instrText>
             </w:r>
             <w:r>
               <w:rPr>
@@ -5116,7 +5233,7 @@
               <w:rPr>
                 <w:noProof/>
               </w:rPr>
-              <w:t>20</w:t>
+              <w:t>21</w:t>
             </w:r>
             <w:r>
               <w:rPr>
@@ -5142,7 +5259,7 @@
               <w14:ligatures w14:val="standardContextual"/>
             </w:rPr>
           </w:pPr>
-          <w:hyperlink w:anchor="_Toc242920500" w:history="1">
+          <w:hyperlink w:anchor="_Toc243739322" w:history="1">
             <w:r>
               <w:rPr>
                 <w:rStyle w:val="Hyperlink"/>
@@ -5166,7 +5283,7 @@
               <w:rPr>
                 <w:noProof/>
               </w:rPr>
-              <w:instrText xml:space="preserve"> PAGEREF _Toc242920500 \h </w:instrText>
+              <w:instrText xml:space="preserve"> PAGEREF _Toc243739322 \h </w:instrText>
             </w:r>
             <w:r>
               <w:rPr>
@@ -5183,7 +5300,7 @@
               <w:rPr>
                 <w:noProof/>
               </w:rPr>
-              <w:t>20</w:t>
+              <w:t>21</w:t>
             </w:r>
             <w:r>
               <w:rPr>
@@ -5209,7 +5326,7 @@
               <w14:ligatures w14:val="standardContextual"/>
             </w:rPr>
           </w:pPr>
-          <w:hyperlink w:anchor="_Toc242920501" w:history="1">
+          <w:hyperlink w:anchor="_Toc243739323" w:history="1">
             <w:r>
               <w:rPr>
                 <w:rStyle w:val="Hyperlink"/>
@@ -5233,7 +5350,7 @@
               <w:rPr>
                 <w:noProof/>
               </w:rPr>
-              <w:instrText xml:space="preserve"> PAGEREF _Toc242920501 \h </w:instrText>
+              <w:instrText xml:space="preserve"> PAGEREF _Toc243739323 \h </w:instrText>
             </w:r>
             <w:r>
               <w:rPr>
@@ -5250,7 +5367,7 @@
               <w:rPr>
                 <w:noProof/>
               </w:rPr>
-              <w:t>20</w:t>
+              <w:t>21</w:t>
             </w:r>
             <w:r>
               <w:rPr>
@@ -5276,7 +5393,7 @@
               <w14:ligatures w14:val="standardContextual"/>
             </w:rPr>
           </w:pPr>
-          <w:hyperlink w:anchor="_Toc242920502" w:history="1">
+          <w:hyperlink w:anchor="_Toc243739324" w:history="1">
             <w:r>
               <w:rPr>
                 <w:rStyle w:val="Hyperlink"/>
@@ -5300,7 +5417,7 @@
               <w:rPr>
                 <w:noProof/>
               </w:rPr>
-              <w:instrText xml:space="preserve"> PAGEREF _Toc242920502 \h </w:instrText>
+              <w:instrText xml:space="preserve"> PAGEREF _Toc243739324 \h </w:instrText>
             </w:r>
             <w:r>
               <w:rPr>
@@ -5317,7 +5434,7 @@
               <w:rPr>
                 <w:noProof/>
               </w:rPr>
-              <w:t>20</w:t>
+              <w:t>21</w:t>
             </w:r>
             <w:r>
               <w:rPr>
@@ -5343,7 +5460,7 @@
               <w14:ligatures w14:val="standardContextual"/>
             </w:rPr>
           </w:pPr>
-          <w:hyperlink w:anchor="_Toc242920503" w:history="1">
+          <w:hyperlink w:anchor="_Toc243739325" w:history="1">
             <w:r>
               <w:rPr>
                 <w:rStyle w:val="Hyperlink"/>
@@ -5367,7 +5484,7 @@
               <w:rPr>
                 <w:noProof/>
               </w:rPr>
-              <w:instrText xml:space="preserve"> PAGEREF _Toc242920503 \h </w:instrText>
+              <w:instrText xml:space="preserve"> PAGEREF _Toc243739325 \h </w:instrText>
             </w:r>
             <w:r>
               <w:rPr>
@@ -5384,7 +5501,7 @@
               <w:rPr>
                 <w:noProof/>
               </w:rPr>
-              <w:t>22</w:t>
+              <w:t>23</w:t>
             </w:r>
             <w:r>
               <w:rPr>
@@ -5410,7 +5527,7 @@
               <w14:ligatures w14:val="standardContextual"/>
             </w:rPr>
           </w:pPr>
-          <w:hyperlink w:anchor="_Toc242920504" w:history="1">
+          <w:hyperlink w:anchor="_Toc243739326" w:history="1">
             <w:r>
               <w:rPr>
                 <w:rStyle w:val="Hyperlink"/>
@@ -5434,7 +5551,7 @@
               <w:rPr>
                 <w:noProof/>
               </w:rPr>
-              <w:instrText xml:space="preserve"> PAGEREF _Toc242920504 \h </w:instrText>
+              <w:instrText xml:space="preserve"> PAGEREF _Toc243739326 \h </w:instrText>
             </w:r>
             <w:r>
               <w:rPr>
@@ -5451,7 +5568,7 @@
               <w:rPr>
                 <w:noProof/>
               </w:rPr>
-              <w:t>23</w:t>
+              <w:t>24</w:t>
             </w:r>
             <w:r>
               <w:rPr>
@@ -5477,7 +5594,7 @@
               <w14:ligatures w14:val="standardContextual"/>
             </w:rPr>
           </w:pPr>
-          <w:hyperlink w:anchor="_Toc242920505" w:history="1">
+          <w:hyperlink w:anchor="_Toc243739327" w:history="1">
             <w:r>
               <w:rPr>
                 <w:rStyle w:val="Hyperlink"/>
@@ -5501,7 +5618,7 @@
               <w:rPr>
                 <w:noProof/>
               </w:rPr>
-              <w:instrText xml:space="preserve"> PAGEREF _Toc242920505 \h </w:instrText>
+              <w:instrText xml:space="preserve"> PAGEREF _Toc243739327 \h </w:instrText>
             </w:r>
             <w:r>
               <w:rPr>
@@ -5518,7 +5635,7 @@
               <w:rPr>
                 <w:noProof/>
               </w:rPr>
-              <w:t>24</w:t>
+              <w:t>25</w:t>
             </w:r>
             <w:r>
               <w:rPr>
@@ -5544,7 +5661,7 @@
               <w14:ligatures w14:val="standardContextual"/>
             </w:rPr>
           </w:pPr>
-          <w:hyperlink w:anchor="_Toc242920506" w:history="1">
+          <w:hyperlink w:anchor="_Toc243739328" w:history="1">
             <w:r>
               <w:rPr>
                 <w:rStyle w:val="Hyperlink"/>
@@ -5568,7 +5685,7 @@
               <w:rPr>
                 <w:noProof/>
               </w:rPr>
-              <w:instrText xml:space="preserve"> PAGEREF _Toc242920506 \h </w:instrText>
+              <w:instrText xml:space="preserve"> PAGEREF _Toc243739328 \h </w:instrText>
             </w:r>
             <w:r>
               <w:rPr>
@@ -5585,7 +5702,7 @@
               <w:rPr>
                 <w:noProof/>
               </w:rPr>
-              <w:t>25</w:t>
+              <w:t>26</w:t>
             </w:r>
             <w:r>
               <w:rPr>
@@ -5611,7 +5728,7 @@
               <w14:ligatures w14:val="standardContextual"/>
             </w:rPr>
           </w:pPr>
-          <w:hyperlink w:anchor="_Toc242920507" w:history="1">
+          <w:hyperlink w:anchor="_Toc243739329" w:history="1">
             <w:r>
               <w:rPr>
                 <w:rStyle w:val="Hyperlink"/>
@@ -5635,7 +5752,7 @@
               <w:rPr>
                 <w:noProof/>
               </w:rPr>
-              <w:instrText xml:space="preserve"> PAGEREF _Toc242920507 \h </w:instrText>
+              <w:instrText xml:space="preserve"> PAGEREF _Toc243739329 \h </w:instrText>
             </w:r>
             <w:r>
               <w:rPr>
@@ -5652,7 +5769,7 @@
               <w:rPr>
                 <w:noProof/>
               </w:rPr>
-              <w:t>26</w:t>
+              <w:t>27</w:t>
             </w:r>
             <w:r>
               <w:rPr>
@@ -5676,7 +5793,7 @@
         <w:keepLines/>
         <w:pageBreakBefore/>
       </w:pPr>
-      <w:bookmarkStart w:id="0" w:name="_Toc242920454"/>
+      <w:bookmarkStart w:id="0" w:name="_Toc243739276"/>
       <w:r>
         <w:lastRenderedPageBreak/>
         <w:t>1 Introduction</w:t>
@@ -5689,7 +5806,7 @@
         <w:keepNext/>
         <w:keepLines/>
       </w:pPr>
-      <w:bookmarkStart w:id="1" w:name="_Toc242920455"/>
+      <w:bookmarkStart w:id="1" w:name="_Toc243739277"/>
       <w:r>
         <w:t>1.1 Purpose</w:t>
       </w:r>
@@ -5709,7 +5826,7 @@
         <w:keepNext/>
         <w:keepLines/>
       </w:pPr>
-      <w:bookmarkStart w:id="2" w:name="_Toc242920456"/>
+      <w:bookmarkStart w:id="2" w:name="_Toc243739278"/>
       <w:r>
         <w:t>1.2 Scope</w:t>
       </w:r>
@@ -5720,10 +5837,7 @@
         <w:spacing w:after="120"/>
       </w:pPr>
       <w:r>
-        <w:t xml:space="preserve">The whole of Releases R1 and R2: the web application (also installable as a progressive web app and wrapped by the </w:t>
-      </w:r>
-      <w:r>
-        <w:t>Android app), the single Cloudflare Worker that serves it and its API, the data and AI services that Worker binds to, the offline data pipeline that compiles the read model, and the release and safety tooling around deployment.</w:t>
+        <w:t>The whole of Releases R1 and R2: the web application (also installable as a progressive web app and wrapped by the Android app), the single Cloudflare Worker that serves it and its API, the data and AI services that Worker binds to, the offline data pipeline that compiles the read model, and the release and safety tooling around deployment.</w:t>
       </w:r>
     </w:p>
     <w:p>
@@ -5732,7 +5846,7 @@
         <w:keepNext/>
         <w:keepLines/>
       </w:pPr>
-      <w:bookmarkStart w:id="3" w:name="_Toc242920457"/>
+      <w:bookmarkStart w:id="3" w:name="_Toc243739279"/>
       <w:r>
         <w:t>1.3 Intended audience</w:t>
       </w:r>
@@ -5752,7 +5866,7 @@
         <w:keepNext/>
         <w:keepLines/>
       </w:pPr>
-      <w:bookmarkStart w:id="4" w:name="_Toc242920458"/>
+      <w:bookmarkStart w:id="4" w:name="_Toc243739280"/>
       <w:r>
         <w:t>1.4 Relationship to other documents</w:t>
       </w:r>
@@ -5763,7 +5877,7 @@
         <w:pStyle w:val="Caption"/>
         <w:keepNext/>
       </w:pPr>
-      <w:bookmarkStart w:id="5" w:name="_Toc242920487"/>
+      <w:bookmarkStart w:id="5" w:name="_Toc243739309"/>
       <w:r>
         <w:t xml:space="preserve">Table </w:t>
       </w:r>
@@ -6336,7 +6450,7 @@
         <w:keepLines/>
         <w:pageBreakBefore/>
       </w:pPr>
-      <w:bookmarkStart w:id="6" w:name="_Toc242920459"/>
+      <w:bookmarkStart w:id="6" w:name="_Toc243739281"/>
       <w:r>
         <w:lastRenderedPageBreak/>
         <w:t>2 Architectural drivers</w:t>
@@ -6349,7 +6463,7 @@
         <w:keepNext/>
         <w:keepLines/>
       </w:pPr>
-      <w:bookmarkStart w:id="7" w:name="_Toc242920460"/>
+      <w:bookmarkStart w:id="7" w:name="_Toc243739282"/>
       <w:r>
         <w:t>2.1 Constraints</w:t>
       </w:r>
@@ -6360,7 +6474,7 @@
         <w:pStyle w:val="Caption"/>
         <w:keepNext/>
       </w:pPr>
-      <w:bookmarkStart w:id="8" w:name="_Toc242920488"/>
+      <w:bookmarkStart w:id="8" w:name="_Toc243739310"/>
       <w:r>
         <w:t xml:space="preserve">Table </w:t>
       </w:r>
@@ -7062,7 +7176,7 @@
         <w:keepNext/>
         <w:keepLines/>
       </w:pPr>
-      <w:bookmarkStart w:id="9" w:name="_Toc242920461"/>
+      <w:bookmarkStart w:id="9" w:name="_Toc243739283"/>
       <w:r>
         <w:t>2.2 Quality attributes</w:t>
       </w:r>
@@ -7073,7 +7187,7 @@
         <w:pStyle w:val="Caption"/>
         <w:keepNext/>
       </w:pPr>
-      <w:bookmarkStart w:id="10" w:name="_Toc242920489"/>
+      <w:bookmarkStart w:id="10" w:name="_Toc243739311"/>
       <w:r>
         <w:t xml:space="preserve">Table </w:t>
       </w:r>
@@ -9559,7 +9673,7 @@
         <w:keepLines/>
         <w:pageBreakBefore/>
       </w:pPr>
-      <w:bookmarkStart w:id="11" w:name="_Toc242920462"/>
+      <w:bookmarkStart w:id="11" w:name="_Toc243739284"/>
       <w:r>
         <w:lastRenderedPageBreak/>
         <w:t>3 System context</w:t>
@@ -9642,7 +9756,7 @@
         <w:pStyle w:val="Caption"/>
         <w:keepNext/>
       </w:pPr>
-      <w:bookmarkStart w:id="12" w:name="_Toc242920490"/>
+      <w:bookmarkStart w:id="12" w:name="_Toc243739312"/>
       <w:r>
         <w:t xml:space="preserve">Table </w:t>
       </w:r>
@@ -10385,7 +10499,7 @@
         <w:keepLines/>
         <w:pageBreakBefore/>
       </w:pPr>
-      <w:bookmarkStart w:id="13" w:name="_Toc242920463"/>
+      <w:bookmarkStart w:id="13" w:name="_Toc243739285"/>
       <w:r>
         <w:lastRenderedPageBreak/>
         <w:t>4 Container and deployment view</w:t>
@@ -10457,7 +10571,7 @@
           <w:noProof/>
         </w:rPr>
         <w:drawing>
-          <wp:inline distT="0" distB="0" distL="0" distR="0" wp14:anchorId="0AFF0023" wp14:editId="0AFF0024">
+          <wp:inline distT="0" distB="0" distL="0" distR="0" wp14:anchorId="4041BAB1" wp14:editId="4041BAB2">
             <wp:extent cx="6124575" cy="4200525"/>
             <wp:effectExtent l="0" t="0" r="0" b="0"/>
             <wp:docPr id="1" name="container-view.png" descr="C4 container view of ZedPath as deployed" title="C4 container view of ZedPath as deployed"/>
@@ -10500,7 +10614,7 @@
       <w:pPr>
         <w:pStyle w:val="Caption"/>
       </w:pPr>
-      <w:bookmarkStart w:id="14" w:name="_Toc242920485"/>
+      <w:bookmarkStart w:id="14" w:name="_Toc243739307"/>
       <w:r>
         <w:t xml:space="preserve">Figure </w:t>
       </w:r>
@@ -10532,7 +10646,7 @@
         <w:pStyle w:val="Caption"/>
         <w:keepNext/>
       </w:pPr>
-      <w:bookmarkStart w:id="15" w:name="_Toc242920491"/>
+      <w:bookmarkStart w:id="15" w:name="_Toc243739313"/>
       <w:r>
         <w:t xml:space="preserve">Table </w:t>
       </w:r>
@@ -12262,7 +12376,7 @@
                 <w:sz w:val="19"/>
                 <w:szCs w:val="19"/>
               </w:rPr>
-              <w:t>Proxies Gemini; cache on; payload logs off</w:t>
+              <w:t>Proxies Claude Haiku 5.5 (first) and Gemini (fallback); cache on; payload logs off</w:t>
             </w:r>
           </w:p>
         </w:tc>
@@ -12459,7 +12573,7 @@
         <w:keepLines/>
         <w:pageBreakBefore/>
       </w:pPr>
-      <w:bookmarkStart w:id="16" w:name="_Toc242920464"/>
+      <w:bookmarkStart w:id="16" w:name="_Toc243739286"/>
       <w:r>
         <w:lastRenderedPageBreak/>
         <w:t>5 Component view</w:t>
@@ -12472,7 +12586,7 @@
         <w:keepNext/>
         <w:keepLines/>
       </w:pPr>
-      <w:bookmarkStart w:id="17" w:name="_Toc242920465"/>
+      <w:bookmarkStart w:id="17" w:name="_Toc243739287"/>
       <w:r>
         <w:t>5.1 Worker modules</w:t>
       </w:r>
@@ -12483,7 +12597,7 @@
         <w:pStyle w:val="Caption"/>
         <w:keepNext/>
       </w:pPr>
-      <w:bookmarkStart w:id="18" w:name="_Toc242920492"/>
+      <w:bookmarkStart w:id="18" w:name="_Toc243739314"/>
       <w:r>
         <w:t xml:space="preserve">Table </w:t>
       </w:r>
@@ -14063,7 +14177,7 @@
         <w:keepNext/>
         <w:keepLines/>
       </w:pPr>
-      <w:bookmarkStart w:id="19" w:name="_Toc242920466"/>
+      <w:bookmarkStart w:id="19" w:name="_Toc243739288"/>
       <w:r>
         <w:t>5.2 Client screens</w:t>
       </w:r>
@@ -14143,7 +14257,7 @@
         <w:keepNext/>
         <w:keepLines/>
       </w:pPr>
-      <w:bookmarkStart w:id="20" w:name="_Toc242920467"/>
+      <w:bookmarkStart w:id="20" w:name="_Toc243739289"/>
       <w:r>
         <w:t>5.3 Shared rule engine</w:t>
       </w:r>
@@ -14302,7 +14416,7 @@
         <w:keepNext/>
         <w:keepLines/>
       </w:pPr>
-      <w:bookmarkStart w:id="21" w:name="_Toc242920468"/>
+      <w:bookmarkStart w:id="21" w:name="_Toc243739290"/>
       <w:r>
         <w:t>5.4 Offline data pipeline</w:t>
       </w:r>
@@ -14415,7 +14529,7 @@
         <w:keepLines/>
         <w:pageBreakBefore/>
       </w:pPr>
-      <w:bookmarkStart w:id="22" w:name="_Toc242920469"/>
+      <w:bookmarkStart w:id="22" w:name="_Toc243739291"/>
       <w:r>
         <w:lastRenderedPageBreak/>
         <w:t>6 Key runtime flows</w:t>
@@ -14428,7 +14542,7 @@
         <w:keepNext/>
         <w:keepLines/>
       </w:pPr>
-      <w:bookmarkStart w:id="23" w:name="_Toc242920470"/>
+      <w:bookmarkStart w:id="23" w:name="_Toc243739292"/>
       <w:r>
         <w:t>6.1 </w:t>
       </w:r>
@@ -14522,7 +14636,7 @@
         <w:keepNext/>
         <w:keepLines/>
       </w:pPr>
-      <w:bookmarkStart w:id="24" w:name="_Toc242920471"/>
+      <w:bookmarkStart w:id="24" w:name="_Toc243739293"/>
       <w:r>
         <w:t>6.2 Ask with citations</w:t>
       </w:r>
@@ -14539,7 +14653,7 @@
           <w:noProof/>
         </w:rPr>
         <w:drawing>
-          <wp:inline distT="0" distB="0" distL="0" distR="0" wp14:anchorId="0AFF0025" wp14:editId="0AFF0026">
+          <wp:inline distT="0" distB="0" distL="0" distR="0" wp14:anchorId="4041BAB3" wp14:editId="4041BAB4">
             <wp:extent cx="6124575" cy="4505325"/>
             <wp:effectExtent l="0" t="0" r="0" b="0"/>
             <wp:docPr id="2" name="seq-ask.png" descr="Ask ZedPath: retrieval, engine facts and generation with model fallback" title="Ask ZedPath: retrieval, engine facts and generation with model fallback"/>
@@ -14582,7 +14696,7 @@
       <w:pPr>
         <w:pStyle w:val="Caption"/>
       </w:pPr>
-      <w:bookmarkStart w:id="25" w:name="_Toc242920486"/>
+      <w:bookmarkStart w:id="25" w:name="_Toc243739308"/>
       <w:r>
         <w:t xml:space="preserve">Figure </w:t>
       </w:r>
@@ -14626,7 +14740,41 @@
         <w:t>usableReply()</w:t>
       </w:r>
       <w:r>
-        <w:t>, which rejects a reply that talks about its own instructions; the next model in the chain (</w:t>
+        <w:t xml:space="preserve">, which rejects a reply that talks about its own instructions. Since 24 October 2026, when </w:t>
+      </w:r>
+      <w:r>
+        <w:rPr>
+          <w:rFonts w:ascii="Consolas" w:eastAsia="Consolas" w:hAnsi="Consolas" w:cs="Consolas"/>
+          <w:sz w:val="19"/>
+          <w:szCs w:val="19"/>
+          <w:shd w:val="clear" w:color="auto" w:fill="F2F4F3"/>
+        </w:rPr>
+        <w:t>ANTHROPIC_API_KEY</w:t>
+      </w:r>
+      <w:r>
+        <w:t xml:space="preserve"> is set, </w:t>
+      </w:r>
+      <w:r>
+        <w:rPr>
+          <w:b/>
+          <w:bCs/>
+        </w:rPr>
+        <w:t>Claude Haiku 5.5</w:t>
+      </w:r>
+      <w:r>
+        <w:t xml:space="preserve"> (</w:t>
+      </w:r>
+      <w:r>
+        <w:rPr>
+          <w:rFonts w:ascii="Consolas" w:eastAsia="Consolas" w:hAnsi="Consolas" w:cs="Consolas"/>
+          <w:sz w:val="19"/>
+          <w:szCs w:val="19"/>
+          <w:shd w:val="clear" w:color="auto" w:fill="F2F4F3"/>
+        </w:rPr>
+        <w:t>claude-haiku-5-5</w:t>
+      </w:r>
+      <w:r>
+        <w:t>, Anthropic Messages API through the same AI Gateway) answers first; any error or unusable reply falls back to the Gemini chain. In that chain the next model (</w:t>
       </w:r>
       <w:r>
         <w:rPr>
@@ -14683,7 +14831,7 @@
         <w:keepNext/>
         <w:keepLines/>
       </w:pPr>
-      <w:bookmarkStart w:id="26" w:name="_Toc242920472"/>
+      <w:bookmarkStart w:id="26" w:name="_Toc243739294"/>
       <w:r>
         <w:lastRenderedPageBreak/>
         <w:t>6.3 Joining a group, rules accepted once</w:t>
@@ -14818,7 +14966,7 @@
         <w:keepNext/>
         <w:keepLines/>
       </w:pPr>
-      <w:bookmarkStart w:id="27" w:name="_Toc242920473"/>
+      <w:bookmarkStart w:id="27" w:name="_Toc243739295"/>
       <w:r>
         <w:t>6.4 Journey step window (409)</w:t>
       </w:r>
@@ -14892,7 +15040,7 @@
         <w:keepNext/>
         <w:keepLines/>
       </w:pPr>
-      <w:bookmarkStart w:id="28" w:name="_Toc242920474"/>
+      <w:bookmarkStart w:id="28" w:name="_Toc243739296"/>
       <w:r>
         <w:t>6.5 Try the demo (CR-007)</w:t>
       </w:r>
@@ -15113,7 +15261,7 @@
         <w:keepNext/>
         <w:keepLines/>
       </w:pPr>
-      <w:bookmarkStart w:id="29" w:name="_Toc242920475"/>
+      <w:bookmarkStart w:id="29" w:name="_Toc243739297"/>
       <w:r>
         <w:t>6.6 Ending a session closes open chats (CR-010)</w:t>
       </w:r>
@@ -15273,7 +15421,10 @@
         <w:spacing w:after="50"/>
       </w:pPr>
       <w:r>
-        <w:t>On the phone, stored results, list and Journey are tagged with the owner's username; a different student logging in clears them first, and a failed log-out is reported instead of being shown as success.</w:t>
+        <w:t xml:space="preserve">On the phone, stored results, list and Journey are tagged with the owner's username; a different student logging in </w:t>
+      </w:r>
+      <w:r>
+        <w:t>clears them first, and a failed log-out is reported instead of being shown as success.</w:t>
       </w:r>
     </w:p>
     <w:p>
@@ -15282,7 +15433,7 @@
         <w:keepNext/>
         <w:keepLines/>
       </w:pPr>
-      <w:bookmarkStart w:id="30" w:name="_Toc242920476"/>
+      <w:bookmarkStart w:id="30" w:name="_Toc243739298"/>
       <w:r>
         <w:t>6.7 Course page: university facts and aptitude test (CR-008, CR-009)</w:t>
       </w:r>
@@ -15350,10 +15501,10 @@
         <w:t>past</w:t>
       </w:r>
       <w:r>
-        <w:t xml:space="preserve"> when the later of its closing date and test date is before today's Sri Lanka date; for the two Uni-Codes whose joint practical test is held elsewhere it returns the notices of the </w:t>
-      </w:r>
-      <w:r>
-        <w:t>universities that hold it. The ETag includes the statistics retrieval date, so a data change reaches phones at once.</w:t>
+        <w:t xml:space="preserve"> when the later of its closing date and test date is before </w:t>
+      </w:r>
+      <w:r>
+        <w:t>today's Sri Lanka date; for the two Uni-Codes whose joint practical test is held elsewhere it returns the notices of the universities that hold it. The ETag includes the statistics retrieval date, so a data change reaches phones at once.</w:t>
       </w:r>
     </w:p>
     <w:p>
@@ -15363,7 +15514,7 @@
         <w:keepLines/>
         <w:pageBreakBefore/>
       </w:pPr>
-      <w:bookmarkStart w:id="31" w:name="_Toc242920477"/>
+      <w:bookmarkStart w:id="31" w:name="_Toc243739299"/>
       <w:r>
         <w:lastRenderedPageBreak/>
         <w:t>7 Security</w:t>
@@ -15375,7 +15526,7 @@
         <w:pStyle w:val="Caption"/>
         <w:keepNext/>
       </w:pPr>
-      <w:bookmarkStart w:id="32" w:name="_Toc242920493"/>
+      <w:bookmarkStart w:id="32" w:name="_Toc243739315"/>
       <w:r>
         <w:t xml:space="preserve">Table </w:t>
       </w:r>
@@ -16012,6 +16163,22 @@
                 <w:szCs w:val="17"/>
                 <w:shd w:val="clear" w:color="auto" w:fill="F2F4F3"/>
               </w:rPr>
+              <w:t>ANTHROPIC_API_KEY</w:t>
+            </w:r>
+            <w:r>
+              <w:rPr>
+                <w:sz w:val="19"/>
+                <w:szCs w:val="19"/>
+              </w:rPr>
+              <w:t xml:space="preserve">, </w:t>
+            </w:r>
+            <w:r>
+              <w:rPr>
+                <w:rFonts w:ascii="Consolas" w:eastAsia="Consolas" w:hAnsi="Consolas" w:cs="Consolas"/>
+                <w:sz w:val="17"/>
+                <w:szCs w:val="17"/>
+                <w:shd w:val="clear" w:color="auto" w:fill="F2F4F3"/>
+              </w:rPr>
               <w:t>GEMINI_API_KEY</w:t>
             </w:r>
             <w:r>
@@ -16841,11 +17008,11 @@
         <w:t>Added 15 October 2026 (leads 4 and 16; test-campaign D-04):</w:t>
       </w:r>
       <w:r>
-        <w:t xml:space="preserve"> reports from accounts under a day old or demo accounts do not count toward hiding; the contact filter also checks a normalised copy (0094, separators, full-width and </w:t>
+        <w:t xml:space="preserve"> reports from accounts under a day old or demo accounts </w:t>
       </w:r>
       <w:r>
         <w:lastRenderedPageBreak/>
-        <w:t xml:space="preserve">spelled-out digits, "[at]" emails, chat-invite links); email length is checked before the pattern | | Deletion and shared phones | </w:t>
+        <w:t xml:space="preserve">do not count toward hiding; the contact filter also checks a normalised copy (0094, separators, full-width and spelled-out digits, "[at]" emails, chat-invite links); email length is checked before the pattern | | Deletion and shared phones | </w:t>
       </w:r>
       <w:r>
         <w:rPr>
@@ -16895,7 +17062,7 @@
         <w:keepLines/>
         <w:pageBreakBefore/>
       </w:pPr>
-      <w:bookmarkStart w:id="33" w:name="_Toc242920478"/>
+      <w:bookmarkStart w:id="33" w:name="_Toc243739300"/>
       <w:r>
         <w:lastRenderedPageBreak/>
         <w:t>8 Free-plan budget</w:t>
@@ -16907,7 +17074,7 @@
         <w:pStyle w:val="Caption"/>
         <w:keepNext/>
       </w:pPr>
-      <w:bookmarkStart w:id="34" w:name="_Toc242920494"/>
+      <w:bookmarkStart w:id="34" w:name="_Toc243739316"/>
       <w:r>
         <w:t xml:space="preserve">Table </w:t>
       </w:r>
@@ -18469,7 +18636,7 @@
         <w:keepLines/>
         <w:pageBreakBefore/>
       </w:pPr>
-      <w:bookmarkStart w:id="35" w:name="_Toc242920479"/>
+      <w:bookmarkStart w:id="35" w:name="_Toc243739301"/>
       <w:r>
         <w:lastRenderedPageBreak/>
         <w:t>9 Architecture decision records</w:t>
@@ -18481,7 +18648,7 @@
         <w:pStyle w:val="Caption"/>
         <w:keepNext/>
       </w:pPr>
-      <w:bookmarkStart w:id="36" w:name="_Toc242920495"/>
+      <w:bookmarkStart w:id="36" w:name="_Toc243739317"/>
       <w:r>
         <w:t xml:space="preserve">Table </w:t>
       </w:r>
@@ -18917,7 +19084,7 @@
         <w:pStyle w:val="Caption"/>
         <w:keepNext/>
       </w:pPr>
-      <w:bookmarkStart w:id="37" w:name="_Toc242920496"/>
+      <w:bookmarkStart w:id="37" w:name="_Toc243739318"/>
       <w:r>
         <w:t xml:space="preserve">Table </w:t>
       </w:r>
@@ -19456,7 +19623,7 @@
         <w:pStyle w:val="Caption"/>
         <w:keepNext/>
       </w:pPr>
-      <w:bookmarkStart w:id="38" w:name="_Toc242920497"/>
+      <w:bookmarkStart w:id="38" w:name="_Toc243739319"/>
       <w:r>
         <w:t xml:space="preserve">Table </w:t>
       </w:r>
@@ -19931,7 +20098,7 @@
         <w:pStyle w:val="Caption"/>
         <w:keepNext/>
       </w:pPr>
-      <w:bookmarkStart w:id="39" w:name="_Toc242920498"/>
+      <w:bookmarkStart w:id="39" w:name="_Toc243739320"/>
       <w:r>
         <w:t xml:space="preserve">Table </w:t>
       </w:r>
@@ -20375,7 +20542,7 @@
         <w:pStyle w:val="Caption"/>
         <w:keepNext/>
       </w:pPr>
-      <w:bookmarkStart w:id="40" w:name="_Toc242920499"/>
+      <w:bookmarkStart w:id="40" w:name="_Toc243739321"/>
       <w:r>
         <w:t xml:space="preserve">Table </w:t>
       </w:r>
@@ -20827,7 +20994,7 @@
         <w:pStyle w:val="Caption"/>
         <w:keepNext/>
       </w:pPr>
-      <w:bookmarkStart w:id="41" w:name="_Toc242920500"/>
+      <w:bookmarkStart w:id="41" w:name="_Toc243739322"/>
       <w:r>
         <w:t xml:space="preserve">Table </w:t>
       </w:r>
@@ -21295,7 +21462,7 @@
         <w:pStyle w:val="Caption"/>
         <w:keepNext/>
       </w:pPr>
-      <w:bookmarkStart w:id="42" w:name="_Toc242920501"/>
+      <w:bookmarkStart w:id="42" w:name="_Toc243739323"/>
       <w:r>
         <w:t xml:space="preserve">Table </w:t>
       </w:r>
@@ -21754,7 +21921,7 @@
         <w:pStyle w:val="Caption"/>
         <w:keepNext/>
       </w:pPr>
-      <w:bookmarkStart w:id="43" w:name="_Toc242920502"/>
+      <w:bookmarkStart w:id="43" w:name="_Toc243739324"/>
       <w:r>
         <w:t xml:space="preserve">Table </w:t>
       </w:r>
@@ -22232,7 +22399,7 @@
         <w:keepLines/>
         <w:pageBreakBefore/>
       </w:pPr>
-      <w:bookmarkStart w:id="44" w:name="_Toc242920480"/>
+      <w:bookmarkStart w:id="44" w:name="_Toc243739302"/>
       <w:r>
         <w:lastRenderedPageBreak/>
         <w:t>10 Deployment and rollback</w:t>
@@ -22244,7 +22411,7 @@
         <w:pStyle w:val="Caption"/>
         <w:keepNext/>
       </w:pPr>
-      <w:bookmarkStart w:id="45" w:name="_Toc242920503"/>
+      <w:bookmarkStart w:id="45" w:name="_Toc243739325"/>
       <w:r>
         <w:t xml:space="preserve">Table </w:t>
       </w:r>
@@ -23086,7 +23253,7 @@
         <w:keepLines/>
         <w:pageBreakBefore/>
       </w:pPr>
-      <w:bookmarkStart w:id="46" w:name="_Toc242920481"/>
+      <w:bookmarkStart w:id="46" w:name="_Toc243739303"/>
       <w:r>
         <w:lastRenderedPageBreak/>
         <w:t>11 Risks</w:t>
@@ -23098,7 +23265,7 @@
         <w:pStyle w:val="Caption"/>
         <w:keepNext/>
       </w:pPr>
-      <w:bookmarkStart w:id="47" w:name="_Toc242920504"/>
+      <w:bookmarkStart w:id="47" w:name="_Toc243739326"/>
       <w:r>
         <w:t xml:space="preserve">Table </w:t>
       </w:r>
@@ -23532,7 +23699,7 @@
                 <w:sz w:val="19"/>
                 <w:szCs w:val="19"/>
               </w:rPr>
-              <w:t>Gemini model retired or rate limited</w:t>
+              <w:t>Model retired, out of credit or rate limited</w:t>
             </w:r>
           </w:p>
         </w:tc>
@@ -23562,7 +23729,7 @@
                 <w:sz w:val="19"/>
                 <w:szCs w:val="19"/>
               </w:rPr>
-              <w:t>Four-model fallback chain through AI Gateway; clear 503 message</w:t>
+              <w:t>Claude Haiku 5.5 first, then a four-model Gemini fallback chain through AI Gateway; clear 503 message</w:t>
             </w:r>
           </w:p>
         </w:tc>
@@ -24324,13 +24491,10 @@
         <w:keepLines/>
         <w:pageBreakBefore/>
       </w:pPr>
-      <w:bookmarkStart w:id="48" w:name="_Toc242920482"/>
+      <w:bookmarkStart w:id="48" w:name="_Toc243739304"/>
       <w:r>
         <w:lastRenderedPageBreak/>
-        <w:t xml:space="preserve">Appendix A: </w:t>
-      </w:r>
-      <w:r>
-        <w:t>Traceability: requirements to architecture</w:t>
+        <w:t>Appendix A: Traceability: requirements to architecture</w:t>
       </w:r>
       <w:bookmarkEnd w:id="48"/>
     </w:p>
@@ -24339,7 +24503,7 @@
         <w:pStyle w:val="Caption"/>
         <w:keepNext/>
       </w:pPr>
-      <w:bookmarkStart w:id="49" w:name="_Toc242920505"/>
+      <w:bookmarkStart w:id="49" w:name="_Toc243739327"/>
       <w:r>
         <w:t xml:space="preserve">Table </w:t>
       </w:r>
@@ -26146,7 +26310,7 @@
         <w:keepLines/>
         <w:pageBreakBefore/>
       </w:pPr>
-      <w:bookmarkStart w:id="50" w:name="_Toc242920483"/>
+      <w:bookmarkStart w:id="50" w:name="_Toc243739305"/>
       <w:r>
         <w:lastRenderedPageBreak/>
         <w:t>Appendix B: Glossary</w:t>
@@ -26158,7 +26322,7 @@
         <w:pStyle w:val="Caption"/>
         <w:keepNext/>
       </w:pPr>
-      <w:bookmarkStart w:id="51" w:name="_Toc242920506"/>
+      <w:bookmarkStart w:id="51" w:name="_Toc243739328"/>
       <w:r>
         <w:t xml:space="preserve">Table </w:t>
       </w:r>
@@ -27483,7 +27647,7 @@
         <w:keepLines/>
         <w:pageBreakBefore/>
       </w:pPr>
-      <w:bookmarkStart w:id="52" w:name="_Toc242920484"/>
+      <w:bookmarkStart w:id="52" w:name="_Toc243739306"/>
       <w:r>
         <w:lastRenderedPageBreak/>
         <w:t>Appendix C: References</w:t>
@@ -27495,7 +27659,7 @@
         <w:pStyle w:val="Caption"/>
         <w:keepNext/>
       </w:pPr>
-      <w:bookmarkStart w:id="53" w:name="_Toc242920507"/>
+      <w:bookmarkStart w:id="53" w:name="_Toc243739329"/>
       <w:r>
         <w:t xml:space="preserve">Table </w:t>
       </w:r>
@@ -28618,134 +28782,10 @@
 <file path=word/numbering.xml><?xml version="1.0" encoding="utf-8"?>
 <w:numbering xmlns:wpc="http://schemas.microsoft.com/office/word/2010/wordprocessingCanvas" xmlns:cx="http://schemas.microsoft.com/office/drawing/2014/chartex" xmlns:cx1="http://schemas.microsoft.com/office/drawing/2015/9/8/chartex" xmlns:cx2="http://schemas.microsoft.com/office/drawing/2015/10/21/chartex" xmlns:cx3="http://schemas.microsoft.com/office/drawing/2016/5/9/chartex" xmlns:cx4="http://schemas.microsoft.com/office/drawing/2016/5/10/chartex" xmlns:cx5="http://schemas.microsoft.com/office/drawing/2016/5/11/chartex" xmlns:cx6="http://schemas.microsoft.com/office/drawing/2016/5/12/chartex" xmlns:cx7="http://schemas.microsoft.com/office/drawing/2016/5/13/chartex" xmlns:cx8="http://schemas.microsoft.com/office/drawing/2016/5/14/chartex" xmlns:mc="http://schemas.openxmlformats.org/markup-compatibility/2006" xmlns:aink="http://schemas.microsoft.com/office/drawing/2016/ink" xmlns:am3d="http://schemas.microsoft.com/office/drawing/2017/model3d" xmlns:o="urn:schemas-microsoft-com:office:office" xmlns:oel="http://schemas.microsoft.com/office/2019/extlst" xmlns:r="http://schemas.openxmlformats.org/officeDocument/2006/relationships" xmlns:m="http://schemas.openxmlformats.org/officeDocument/2006/math" xmlns:v="urn:schemas-microsoft-com:vml" xmlns:wp14="http://schemas.microsoft.com/office/word/2010/wordprocessingDrawing" xmlns:wp="http://schemas.openxmlformats.org/drawingml/2006/wordprocessingDrawing" xmlns:w10="urn:schemas-microsoft-com:office:word" xmlns:w="http://schemas.openxmlformats.org/wordprocessingml/2006/main" xmlns:w14="http://schemas.microsoft.com/office/word/2010/wordml" xmlns:w15="http://schemas.microsoft.com/office/word/2012/wordml" xmlns:w16cex="http://schemas.microsoft.com/office/word/2018/wordml/cex" xmlns:w16cid="http://schemas.microsoft.com/office/word/2016/wordml/cid" xmlns:w16="http://schemas.microsoft.com/office/word/2018/wordml" xmlns:w16du="http://schemas.microsoft.com/office/word/2023/wordml/word16du" xmlns:w16sdtdh="http://schemas.microsoft.com/office/word/2020/wordml/sdtdatahash" xmlns:w16sdtfl="http://schemas.microsoft.com/office/word/2024/wordml/sdtformatlock" xmlns:w16se="http://schemas.microsoft.com/office/word/2015/wordml/symex" xmlns:wpg="http://schemas.microsoft.com/office/word/2010/wordprocessingGroup" xmlns:wpi="http://schemas.microsoft.com/office/word/2010/wordprocessingInk" xmlns:wne="http://schemas.microsoft.com/office/word/2006/wordml" xmlns:wps="http://schemas.microsoft.com/office/word/2010/wordprocessingShape" mc:Ignorable="w14 w15 w16se w16cid w16 w16cex w16sdtdh w16sdtfl w16du wp14">
   <w:abstractNum w:abstractNumId="0" w15:restartNumberingAfterBreak="0">
-    <w:nsid w:val="1DD35FA0"/>
+    <w:nsid w:val="341D099B"/>
     <w:multiLevelType w:val="hybridMultilevel"/>
-    <w:tmpl w:val="6B949070"/>
-    <w:lvl w:ilvl="0" w:tplc="8634E55C" w:tentative="1">
-      <w:start w:val="1"/>
-      <w:numFmt w:val="bullet"/>
-      <w:lvlText w:val="•"/>
-      <w:lvlJc w:val="left"/>
-      <w:pPr>
-        <w:ind w:left="720" w:hanging="280"/>
-      </w:pPr>
-    </w:lvl>
-    <w:lvl w:ilvl="1" w:tplc="92B808D6" w:tentative="1">
-      <w:start w:val="1"/>
-      <w:numFmt w:val="bullet"/>
-      <w:lvlText w:val="–"/>
-      <w:lvlJc w:val="left"/>
-      <w:pPr>
-        <w:ind w:left="1080" w:hanging="280"/>
-      </w:pPr>
-    </w:lvl>
-    <w:lvl w:ilvl="2" w:tplc="5582D384" w:tentative="1">
-      <w:start w:val="1"/>
-      <w:numFmt w:val="bullet"/>
-      <w:lvlText w:val="▪"/>
-      <w:lvlJc w:val="left"/>
-      <w:pPr>
-        <w:ind w:left="1440" w:hanging="280"/>
-      </w:pPr>
-    </w:lvl>
-    <w:lvl w:ilvl="3" w:tplc="2B26B81C">
-      <w:numFmt w:val="decimal"/>
-      <w:lvlText w:val=""/>
-      <w:lvlJc w:val="left"/>
-    </w:lvl>
-    <w:lvl w:ilvl="4" w:tplc="851C18D8">
-      <w:numFmt w:val="decimal"/>
-      <w:lvlText w:val=""/>
-      <w:lvlJc w:val="left"/>
-    </w:lvl>
-    <w:lvl w:ilvl="5" w:tplc="8D406AA0">
-      <w:numFmt w:val="decimal"/>
-      <w:lvlText w:val=""/>
-      <w:lvlJc w:val="left"/>
-    </w:lvl>
-    <w:lvl w:ilvl="6" w:tplc="E9389D7C">
-      <w:numFmt w:val="decimal"/>
-      <w:lvlText w:val=""/>
-      <w:lvlJc w:val="left"/>
-    </w:lvl>
-    <w:lvl w:ilvl="7" w:tplc="14B22EDC">
-      <w:numFmt w:val="decimal"/>
-      <w:lvlText w:val=""/>
-      <w:lvlJc w:val="left"/>
-    </w:lvl>
-    <w:lvl w:ilvl="8" w:tplc="0AF48DA2">
-      <w:numFmt w:val="decimal"/>
-      <w:lvlText w:val=""/>
-      <w:lvlJc w:val="left"/>
-    </w:lvl>
-  </w:abstractNum>
-  <w:abstractNum w:abstractNumId="1" w15:restartNumberingAfterBreak="0">
-    <w:nsid w:val="3C3B703B"/>
-    <w:multiLevelType w:val="hybridMultilevel"/>
-    <w:tmpl w:val="C7D83EF4"/>
-    <w:lvl w:ilvl="0" w:tplc="8D7A15C4">
-      <w:start w:val="1"/>
-      <w:numFmt w:val="decimal"/>
-      <w:lvlText w:val="%1."/>
-      <w:lvlJc w:val="left"/>
-      <w:pPr>
-        <w:ind w:left="720" w:hanging="360"/>
-      </w:pPr>
-    </w:lvl>
-    <w:lvl w:ilvl="1" w:tplc="4AE46B9C" w:tentative="1">
-      <w:start w:val="1"/>
-      <w:numFmt w:val="lowerLetter"/>
-      <w:lvlText w:val="%2."/>
-      <w:lvlJc w:val="left"/>
-      <w:pPr>
-        <w:ind w:left="1080" w:hanging="360"/>
-      </w:pPr>
-    </w:lvl>
-    <w:lvl w:ilvl="2" w:tplc="B510B78C" w:tentative="1">
-      <w:start w:val="1"/>
-      <w:numFmt w:val="lowerRoman"/>
-      <w:lvlText w:val="%3."/>
-      <w:lvlJc w:val="left"/>
-      <w:pPr>
-        <w:ind w:left="1440" w:hanging="360"/>
-      </w:pPr>
-    </w:lvl>
-    <w:lvl w:ilvl="3" w:tplc="05060730">
-      <w:numFmt w:val="decimal"/>
-      <w:lvlText w:val=""/>
-      <w:lvlJc w:val="left"/>
-    </w:lvl>
-    <w:lvl w:ilvl="4" w:tplc="0A34C3FA">
-      <w:numFmt w:val="decimal"/>
-      <w:lvlText w:val=""/>
-      <w:lvlJc w:val="left"/>
-    </w:lvl>
-    <w:lvl w:ilvl="5" w:tplc="E7540392">
-      <w:numFmt w:val="decimal"/>
-      <w:lvlText w:val=""/>
-      <w:lvlJc w:val="left"/>
-    </w:lvl>
-    <w:lvl w:ilvl="6" w:tplc="3B06E716">
-      <w:numFmt w:val="decimal"/>
-      <w:lvlText w:val=""/>
-      <w:lvlJc w:val="left"/>
-    </w:lvl>
-    <w:lvl w:ilvl="7" w:tplc="FD6A6DCA">
-      <w:numFmt w:val="decimal"/>
-      <w:lvlText w:val=""/>
-      <w:lvlJc w:val="left"/>
-    </w:lvl>
-    <w:lvl w:ilvl="8" w:tplc="4D784F10">
-      <w:numFmt w:val="decimal"/>
-      <w:lvlText w:val=""/>
-      <w:lvlJc w:val="left"/>
-    </w:lvl>
-  </w:abstractNum>
-  <w:abstractNum w:abstractNumId="2" w15:restartNumberingAfterBreak="0">
-    <w:nsid w:val="732F14CB"/>
-    <w:multiLevelType w:val="hybridMultilevel"/>
-    <w:tmpl w:val="7CAC4FF4"/>
-    <w:lvl w:ilvl="0" w:tplc="9D1EF59A" w:tentative="1">
+    <w:tmpl w:val="D7161EB6"/>
+    <w:lvl w:ilvl="0" w:tplc="A7E0E9FC" w:tentative="1">
       <w:start w:val="1"/>
       <w:numFmt w:val="bullet"/>
       <w:lvlText w:val="●"/>
@@ -28754,7 +28794,7 @@
         <w:ind w:left="720" w:hanging="360"/>
       </w:pPr>
     </w:lvl>
-    <w:lvl w:ilvl="1" w:tplc="9BFE0914" w:tentative="1">
+    <w:lvl w:ilvl="1" w:tplc="E78A1F9C" w:tentative="1">
       <w:start w:val="1"/>
       <w:numFmt w:val="bullet"/>
       <w:lvlText w:val="○"/>
@@ -28763,7 +28803,7 @@
         <w:ind w:left="1440" w:hanging="360"/>
       </w:pPr>
     </w:lvl>
-    <w:lvl w:ilvl="2" w:tplc="B1D02B52" w:tentative="1">
+    <w:lvl w:ilvl="2" w:tplc="27EC1090" w:tentative="1">
       <w:start w:val="1"/>
       <w:numFmt w:val="bullet"/>
       <w:lvlText w:val="■"/>
@@ -28772,7 +28812,7 @@
         <w:ind w:left="2160" w:hanging="360"/>
       </w:pPr>
     </w:lvl>
-    <w:lvl w:ilvl="3" w:tplc="35824876" w:tentative="1">
+    <w:lvl w:ilvl="3" w:tplc="B8926F70" w:tentative="1">
       <w:start w:val="1"/>
       <w:numFmt w:val="bullet"/>
       <w:lvlText w:val="●"/>
@@ -28781,7 +28821,7 @@
         <w:ind w:left="2880" w:hanging="360"/>
       </w:pPr>
     </w:lvl>
-    <w:lvl w:ilvl="4" w:tplc="36B04D0C" w:tentative="1">
+    <w:lvl w:ilvl="4" w:tplc="95AA171E" w:tentative="1">
       <w:start w:val="1"/>
       <w:numFmt w:val="bullet"/>
       <w:lvlText w:val="○"/>
@@ -28790,7 +28830,7 @@
         <w:ind w:left="3600" w:hanging="360"/>
       </w:pPr>
     </w:lvl>
-    <w:lvl w:ilvl="5" w:tplc="2A464DA8" w:tentative="1">
+    <w:lvl w:ilvl="5" w:tplc="500EB904" w:tentative="1">
       <w:start w:val="1"/>
       <w:numFmt w:val="bullet"/>
       <w:lvlText w:val="■"/>
@@ -28799,7 +28839,7 @@
         <w:ind w:left="4320" w:hanging="360"/>
       </w:pPr>
     </w:lvl>
-    <w:lvl w:ilvl="6" w:tplc="8982A580" w:tentative="1">
+    <w:lvl w:ilvl="6" w:tplc="5D46B5E6" w:tentative="1">
       <w:start w:val="1"/>
       <w:numFmt w:val="bullet"/>
       <w:lvlText w:val="●"/>
@@ -28808,7 +28848,7 @@
         <w:ind w:left="5040" w:hanging="360"/>
       </w:pPr>
     </w:lvl>
-    <w:lvl w:ilvl="7" w:tplc="967EC364" w:tentative="1">
+    <w:lvl w:ilvl="7" w:tplc="EEBAE1D6" w:tentative="1">
       <w:start w:val="1"/>
       <w:numFmt w:val="bullet"/>
       <w:lvlText w:val="●"/>
@@ -28817,7 +28857,7 @@
         <w:ind w:left="5760" w:hanging="360"/>
       </w:pPr>
     </w:lvl>
-    <w:lvl w:ilvl="8" w:tplc="5D921F26" w:tentative="1">
+    <w:lvl w:ilvl="8" w:tplc="4C70F120" w:tentative="1">
       <w:start w:val="1"/>
       <w:numFmt w:val="bullet"/>
       <w:lvlText w:val="●"/>
@@ -28827,32 +28867,156 @@
       </w:pPr>
     </w:lvl>
   </w:abstractNum>
-  <w:num w:numId="1" w16cid:durableId="980383388">
+  <w:abstractNum w:abstractNumId="1" w15:restartNumberingAfterBreak="0">
+    <w:nsid w:val="6F3E5A23"/>
+    <w:multiLevelType w:val="hybridMultilevel"/>
+    <w:tmpl w:val="57A024F2"/>
+    <w:lvl w:ilvl="0" w:tplc="C9C6256C" w:tentative="1">
+      <w:start w:val="1"/>
+      <w:numFmt w:val="bullet"/>
+      <w:lvlText w:val="•"/>
+      <w:lvlJc w:val="left"/>
+      <w:pPr>
+        <w:ind w:left="720" w:hanging="280"/>
+      </w:pPr>
+    </w:lvl>
+    <w:lvl w:ilvl="1" w:tplc="288266A4" w:tentative="1">
+      <w:start w:val="1"/>
+      <w:numFmt w:val="bullet"/>
+      <w:lvlText w:val="–"/>
+      <w:lvlJc w:val="left"/>
+      <w:pPr>
+        <w:ind w:left="1080" w:hanging="280"/>
+      </w:pPr>
+    </w:lvl>
+    <w:lvl w:ilvl="2" w:tplc="3D4E56B2" w:tentative="1">
+      <w:start w:val="1"/>
+      <w:numFmt w:val="bullet"/>
+      <w:lvlText w:val="▪"/>
+      <w:lvlJc w:val="left"/>
+      <w:pPr>
+        <w:ind w:left="1440" w:hanging="280"/>
+      </w:pPr>
+    </w:lvl>
+    <w:lvl w:ilvl="3" w:tplc="5B483EAE">
+      <w:numFmt w:val="decimal"/>
+      <w:lvlText w:val=""/>
+      <w:lvlJc w:val="left"/>
+    </w:lvl>
+    <w:lvl w:ilvl="4" w:tplc="2304C4F2">
+      <w:numFmt w:val="decimal"/>
+      <w:lvlText w:val=""/>
+      <w:lvlJc w:val="left"/>
+    </w:lvl>
+    <w:lvl w:ilvl="5" w:tplc="F2B4AACA">
+      <w:numFmt w:val="decimal"/>
+      <w:lvlText w:val=""/>
+      <w:lvlJc w:val="left"/>
+    </w:lvl>
+    <w:lvl w:ilvl="6" w:tplc="95346B26">
+      <w:numFmt w:val="decimal"/>
+      <w:lvlText w:val=""/>
+      <w:lvlJc w:val="left"/>
+    </w:lvl>
+    <w:lvl w:ilvl="7" w:tplc="12FCC17E">
+      <w:numFmt w:val="decimal"/>
+      <w:lvlText w:val=""/>
+      <w:lvlJc w:val="left"/>
+    </w:lvl>
+    <w:lvl w:ilvl="8" w:tplc="B986F4C2">
+      <w:numFmt w:val="decimal"/>
+      <w:lvlText w:val=""/>
+      <w:lvlJc w:val="left"/>
+    </w:lvl>
+  </w:abstractNum>
+  <w:abstractNum w:abstractNumId="2" w15:restartNumberingAfterBreak="0">
+    <w:nsid w:val="737F19C8"/>
+    <w:multiLevelType w:val="hybridMultilevel"/>
+    <w:tmpl w:val="A2F89A34"/>
+    <w:lvl w:ilvl="0" w:tplc="55CCE36A">
+      <w:start w:val="1"/>
+      <w:numFmt w:val="decimal"/>
+      <w:lvlText w:val="%1."/>
+      <w:lvlJc w:val="left"/>
+      <w:pPr>
+        <w:ind w:left="720" w:hanging="360"/>
+      </w:pPr>
+    </w:lvl>
+    <w:lvl w:ilvl="1" w:tplc="D3F036EA" w:tentative="1">
+      <w:start w:val="1"/>
+      <w:numFmt w:val="lowerLetter"/>
+      <w:lvlText w:val="%2."/>
+      <w:lvlJc w:val="left"/>
+      <w:pPr>
+        <w:ind w:left="1080" w:hanging="360"/>
+      </w:pPr>
+    </w:lvl>
+    <w:lvl w:ilvl="2" w:tplc="258257F8" w:tentative="1">
+      <w:start w:val="1"/>
+      <w:numFmt w:val="lowerRoman"/>
+      <w:lvlText w:val="%3."/>
+      <w:lvlJc w:val="left"/>
+      <w:pPr>
+        <w:ind w:left="1440" w:hanging="360"/>
+      </w:pPr>
+    </w:lvl>
+    <w:lvl w:ilvl="3" w:tplc="538CB35C">
+      <w:numFmt w:val="decimal"/>
+      <w:lvlText w:val=""/>
+      <w:lvlJc w:val="left"/>
+    </w:lvl>
+    <w:lvl w:ilvl="4" w:tplc="5ECC4ADE">
+      <w:numFmt w:val="decimal"/>
+      <w:lvlText w:val=""/>
+      <w:lvlJc w:val="left"/>
+    </w:lvl>
+    <w:lvl w:ilvl="5" w:tplc="B39E3F36">
+      <w:numFmt w:val="decimal"/>
+      <w:lvlText w:val=""/>
+      <w:lvlJc w:val="left"/>
+    </w:lvl>
+    <w:lvl w:ilvl="6" w:tplc="698218EC">
+      <w:numFmt w:val="decimal"/>
+      <w:lvlText w:val=""/>
+      <w:lvlJc w:val="left"/>
+    </w:lvl>
+    <w:lvl w:ilvl="7" w:tplc="97004D8C">
+      <w:numFmt w:val="decimal"/>
+      <w:lvlText w:val=""/>
+      <w:lvlJc w:val="left"/>
+    </w:lvl>
+    <w:lvl w:ilvl="8" w:tplc="430EF4A0">
+      <w:numFmt w:val="decimal"/>
+      <w:lvlText w:val=""/>
+      <w:lvlJc w:val="left"/>
+    </w:lvl>
+  </w:abstractNum>
+  <w:num w:numId="1" w16cid:durableId="991451205">
+    <w:abstractNumId w:val="0"/>
+    <w:lvlOverride w:ilvl="0">
+      <w:startOverride w:val="1"/>
+    </w:lvlOverride>
+  </w:num>
+  <w:num w:numId="2" w16cid:durableId="560290010">
     <w:abstractNumId w:val="2"/>
     <w:lvlOverride w:ilvl="0">
       <w:startOverride w:val="1"/>
     </w:lvlOverride>
   </w:num>
-  <w:num w:numId="2" w16cid:durableId="760370585">
-    <w:abstractNumId w:val="1"/>
+  <w:num w:numId="3" w16cid:durableId="534924070">
+    <w:abstractNumId w:val="2"/>
     <w:lvlOverride w:ilvl="0">
       <w:startOverride w:val="1"/>
     </w:lvlOverride>
   </w:num>
-  <w:num w:numId="3" w16cid:durableId="649284611">
-    <w:abstractNumId w:val="1"/>
+  <w:num w:numId="4" w16cid:durableId="1136410906">
+    <w:abstractNumId w:val="2"/>
     <w:lvlOverride w:ilvl="0">
       <w:startOverride w:val="1"/>
     </w:lvlOverride>
   </w:num>
-  <w:num w:numId="4" w16cid:durableId="1184632479">
-    <w:abstractNumId w:val="1"/>
-    <w:lvlOverride w:ilvl="0">
-      <w:startOverride w:val="1"/>
-    </w:lvlOverride>
-  </w:num>
-  <w:num w:numId="5" w16cid:durableId="1752702450">
-    <w:abstractNumId w:val="1"/>
+  <w:num w:numId="5" w16cid:durableId="1998419758">
+    <w:abstractNumId w:val="2"/>
     <w:lvlOverride w:ilvl="0">
       <w:startOverride w:val="1"/>
     </w:lvlOverride>
@@ -29556,7 +29720,7 @@
     <w:autoRedefine/>
     <w:uiPriority w:val="39"/>
     <w:unhideWhenUsed/>
-    <w:rsid w:val="00A07747"/>
+    <w:rsid w:val="001E2A5A"/>
     <w:pPr>
       <w:spacing w:after="100"/>
     </w:pPr>
@@ -29568,7 +29732,7 @@
     <w:autoRedefine/>
     <w:uiPriority w:val="39"/>
     <w:unhideWhenUsed/>
-    <w:rsid w:val="00A07747"/>
+    <w:rsid w:val="001E2A5A"/>
     <w:pPr>
       <w:spacing w:after="100"/>
       <w:ind w:left="210"/>
@@ -29580,7 +29744,7 @@
     <w:next w:val="Normal"/>
     <w:uiPriority w:val="99"/>
     <w:unhideWhenUsed/>
-    <w:rsid w:val="00A07747"/>
+    <w:rsid w:val="001E2A5A"/>
   </w:style>
 </w:styles>
 </file>

</xml_diff>